<commit_message>
Realizada subida de documentos
</commit_message>
<xml_diff>
--- a/docu/PROYECTO_LOPEZFERNANDEZ_DANIEL.docx
+++ b/docu/PROYECTO_LOPEZFERNANDEZ_DANIEL.docx
@@ -16886,10 +16886,456 @@
       <w:bookmarkEnd w:id="25"/>
     </w:p>
     <w:p>
-      <w:r>
-        <w:t>(…)</w:t>
-      </w:r>
-    </w:p>
+      <w:pPr>
+        <w:jc w:val="both"/>
+      </w:pPr>
+      <w:r>
+        <w:t>Para el desarrollo de Gestion@ se han utilizado una serie de tecnologías, frameworks y herramientas que han permitido llevar a cabo tanto el diseño como la implementación completa de la aplicación. La elección de cada una de ellas ha estado orientada a garantizar la solidez técnica del proyecto, la escalabilidad de la arquitectura y la facilidad de mantenimiento del código. A continuación, se detallan cada una de ellas, agrupadas según su función dentro del proyecto.</w:t>
+      </w:r>
+    </w:p>
+    <w:p>
+      <w:pPr>
+        <w:jc w:val="both"/>
+      </w:pPr>
+      <w:r>
+        <w:rPr>
+          <w:b/>
+          <w:bCs/>
+        </w:rPr>
+        <w:t>Backend</w:t>
+      </w:r>
+    </w:p>
+    <w:p>
+      <w:pPr>
+        <w:jc w:val="both"/>
+      </w:pPr>
+      <w:r>
+        <w:t xml:space="preserve">El lenguaje de programación principal utilizado para el desarrollo del backend ha sido </w:t>
+      </w:r>
+      <w:r>
+        <w:rPr>
+          <w:b/>
+          <w:bCs/>
+        </w:rPr>
+        <w:t>Java</w:t>
+      </w:r>
+      <w:r>
+        <w:t xml:space="preserve">, concretamente en su versión </w:t>
+      </w:r>
+      <w:r>
+        <w:rPr>
+          <w:b/>
+          <w:bCs/>
+        </w:rPr>
+        <w:t>21</w:t>
+      </w:r>
+      <w:r>
+        <w:t>, que es la versión LTS (Long Term Support) más reciente en el momento del desarrollo del proyecto. Java ha sido escogido por ser un lenguaje fuertemente tipado, orientado a objetos y ampliamente utilizado en el desarrollo de aplicaciones empresariales, lo que lo convierte en una elección sólida y adecuada para un proyecto de esta naturaleza.</w:t>
+      </w:r>
+    </w:p>
+    <w:p>
+      <w:pPr>
+        <w:jc w:val="both"/>
+      </w:pPr>
+      <w:r>
+        <w:t xml:space="preserve">Sobre Java, se ha utilizado el framework </w:t>
+      </w:r>
+      <w:r>
+        <w:rPr>
+          <w:b/>
+          <w:bCs/>
+        </w:rPr>
+        <w:t>Spring Boot</w:t>
+      </w:r>
+      <w:r>
+        <w:t xml:space="preserve">, en su versión </w:t>
+      </w:r>
+      <w:r>
+        <w:rPr>
+          <w:b/>
+          <w:bCs/>
+        </w:rPr>
+        <w:t>3.2.5</w:t>
+      </w:r>
+      <w:r>
+        <w:t>, el cual simplifica enormemente la configuración y el despliegue de aplicaciones basadas en Spring, eliminando la necesidad de configuraciones XML complejas y permitiendo un arranque rápido del proyecto. Spring Boot es actualmente uno de los frameworks más utilizados a nivel mundial para el desarrollo de aplicaciones web en Java, y su ecosistema de módulos ha cubierto prácticamente todas las necesidades técnicas del proyecto. Los módulos de Spring utilizados han sido los siguientes:</w:t>
+      </w:r>
+    </w:p>
+    <w:p>
+      <w:pPr>
+        <w:numPr>
+          <w:ilvl w:val="0"/>
+          <w:numId w:val="32"/>
+        </w:numPr>
+        <w:jc w:val="both"/>
+      </w:pPr>
+      <w:r>
+        <w:rPr>
+          <w:b/>
+          <w:bCs/>
+        </w:rPr>
+        <w:t>Spring Web</w:t>
+      </w:r>
+      <w:r>
+        <w:t>: módulo encargado de gestionar toda la capa de presentación y comunicación HTTP de la aplicación. Permite la definición de controladores mediante la anotación @Controller, la gestión de las rutas de la aplicación y el procesamiento de las peticiones y respuestas HTTP. Ha sido el pilar fundamental de la arquitectura MVC del proyecto.</w:t>
+      </w:r>
+    </w:p>
+    <w:p>
+      <w:pPr>
+        <w:numPr>
+          <w:ilvl w:val="0"/>
+          <w:numId w:val="32"/>
+        </w:numPr>
+        <w:jc w:val="both"/>
+      </w:pPr>
+      <w:r>
+        <w:rPr>
+          <w:b/>
+          <w:bCs/>
+        </w:rPr>
+        <w:t>Spring Data JPA</w:t>
+      </w:r>
+      <w:r>
+        <w:t>: módulo que facilita el acceso a la base de datos mediante el uso del estándar JPA (Java Persistence API) y su implementación a través de Hibernate como proveedor ORM (Object-Relational Mapping). Gracias a este módulo, se ha podido abstraer completamente la capa de acceso a datos mediante el uso de repositorios que extienden JpaRepository, evitando la escritura manual de consultas SQL para las operaciones básicas, y utilizando JPQL o métodos derivados del nombre para las consultas más específicas.</w:t>
+      </w:r>
+    </w:p>
+    <w:p>
+      <w:pPr>
+        <w:numPr>
+          <w:ilvl w:val="0"/>
+          <w:numId w:val="32"/>
+        </w:numPr>
+        <w:jc w:val="both"/>
+      </w:pPr>
+      <w:r>
+        <w:rPr>
+          <w:b/>
+          <w:bCs/>
+        </w:rPr>
+        <w:t>Spring Security</w:t>
+      </w:r>
+      <w:r>
+        <w:t xml:space="preserve">: se ha integrado en el proyecto para gestionar la configuración de seguridad de la aplicación. No obstante, dado el alcance del proyecto, la autenticación de los usuarios se ha implementado de forma manual mediante el uso de sesiones HTTP gestionadas directamente en los controladores. Las contraseñas de todos los usuarios se almacenan en la base de datos cifradas mediante el algoritmo </w:t>
+      </w:r>
+      <w:r>
+        <w:rPr>
+          <w:b/>
+          <w:bCs/>
+        </w:rPr>
+        <w:t>BCrypt</w:t>
+      </w:r>
+      <w:r>
+        <w:t>, haciendo uso de la clase PasswordEncoder proporcionada por Spring Security, lo que garantiza que en ningún momento se almacenen contraseñas en texto plano.</w:t>
+      </w:r>
+    </w:p>
+    <w:p>
+      <w:pPr>
+        <w:numPr>
+          <w:ilvl w:val="0"/>
+          <w:numId w:val="32"/>
+        </w:numPr>
+        <w:jc w:val="both"/>
+      </w:pPr>
+      <w:r>
+        <w:rPr>
+          <w:b/>
+          <w:bCs/>
+        </w:rPr>
+        <w:t>Spring Validation</w:t>
+      </w:r>
+      <w:r>
+        <w:t>: módulo utilizado para la validación de los datos de entrada en los formularios y en las peticiones realizadas al servidor. Permite definir restricciones directamente sobre los atributos de los DTOs y entidades mediante anotaciones estándar de Jakarta Validation, asegurando la integridad de los datos antes de que lleguen a la capa de negocio.</w:t>
+      </w:r>
+    </w:p>
+    <w:p>
+      <w:pPr>
+        <w:numPr>
+          <w:ilvl w:val="0"/>
+          <w:numId w:val="32"/>
+        </w:numPr>
+        <w:jc w:val="both"/>
+      </w:pPr>
+      <w:r>
+        <w:rPr>
+          <w:b/>
+          <w:bCs/>
+        </w:rPr>
+        <w:lastRenderedPageBreak/>
+        <w:t>Spring Scheduling</w:t>
+      </w:r>
+      <w:r>
+        <w:t>: se ha utilizado para la automatización de tareas periódicas dentro de la aplicación. Concretamente, se ha implementado un componente PracticaScheduler que se ejecuta automáticamente cada día a las 6:00 de la mañana mediante la anotación @Scheduled(cron = "0 0 6 * * *"). Esta tarea se encarga de revisar el estado de todas las prácticas registradas en el sistema, activando aquellas cuya fecha de inicio ha llegado y finalizando aquellas cuya fecha de fin ya ha pasado, generando además notificaciones automáticas para los alumnos afectados. Adicionalmente, esta misma comprobación se lanza también en el arranque de la aplicación mediante @EventListener(ApplicationReadyEvent.class), garantizando que el estado de las prácticas sea siempre coherente desde el primer momento.</w:t>
+      </w:r>
+    </w:p>
+    <w:p>
+      <w:pPr>
+        <w:jc w:val="both"/>
+      </w:pPr>
+      <w:r>
+        <w:t xml:space="preserve">En cuanto al </w:t>
+      </w:r>
+      <w:r>
+        <w:rPr>
+          <w:b/>
+          <w:bCs/>
+        </w:rPr>
+        <w:t>modelo de datos en Java</w:t>
+      </w:r>
+      <w:r>
+        <w:t>, se ha seguido un patrón de herencia mediante una clase abstracta llamada Usuario, anotada con @MappedSuperclass, de la cual heredan los cuatro roles de la aplicación: AlumnoRol, CoordinadorRol, GestorRol y AdministracionRol. Esta clase concentra todos los atributos comunes a los usuarios del sistema, como el identificador, el DNI, el nombre, los apellidos, el email, la contraseña y el estado de activación. Al usar @MappedSuperclass, Hibernate mapea cada subclase a su propia tabla en la base de datos sin crear una tabla para la superclase, lo que se corresponde directamente con el esquema relacional diseñado. Cada rol dispone además de sus propios atributos específicos y de su propia entidad JPA anotada con @Entity y @Table.</w:t>
+      </w:r>
+    </w:p>
+    <w:p>
+      <w:pPr>
+        <w:jc w:val="both"/>
+      </w:pPr>
+      <w:r>
+        <w:t xml:space="preserve">Para la transferencia de datos entre la capa de presentación y la capa de negocio se han utilizado </w:t>
+      </w:r>
+      <w:r>
+        <w:rPr>
+          <w:b/>
+          <w:bCs/>
+        </w:rPr>
+        <w:t>DTOs</w:t>
+      </w:r>
+      <w:r>
+        <w:t xml:space="preserve"> (Data Transfer Objects), como CrearUsuarioDTO o UsuarioListaDTO, que permiten desacoplar la estructura interna de las entidades del modelo de datos de los datos que se muestran o reciben en las vistas, mejorando así la seguridad y la mantenibilidad del código.</w:t>
+      </w:r>
+    </w:p>
+    <w:p>
+      <w:pPr>
+        <w:jc w:val="both"/>
+      </w:pPr>
+      <w:r>
+        <w:rPr>
+          <w:b/>
+          <w:bCs/>
+        </w:rPr>
+        <w:t>Frontend</w:t>
+      </w:r>
+    </w:p>
+    <w:p>
+      <w:pPr>
+        <w:jc w:val="both"/>
+      </w:pPr>
+      <w:r>
+        <w:t xml:space="preserve">Para la capa de presentación se ha utilizado </w:t>
+      </w:r>
+      <w:r>
+        <w:rPr>
+          <w:b/>
+          <w:bCs/>
+        </w:rPr>
+        <w:t>Thymeleaf</w:t>
+      </w:r>
+      <w:r>
+        <w:t xml:space="preserve"> como motor de plantillas del lado del servidor. Thymeleaf se integra de forma nativa con Spring Boot y permite generar las vistas HTML de forma dinámica en el servidor, inyectando los datos del modelo directamente en las plantillas. Su sintaxis es compatible con HTML5 estándar, lo que facilita la edición de las plantillas en cualquier editor o navegador sin necesidad de un servidor activo.</w:t>
+      </w:r>
+    </w:p>
+    <w:p>
+      <w:pPr>
+        <w:jc w:val="both"/>
+      </w:pPr>
+      <w:r>
+        <w:t xml:space="preserve">Las interfaces de usuario han sido desarrolladas con </w:t>
+      </w:r>
+      <w:r>
+        <w:rPr>
+          <w:b/>
+          <w:bCs/>
+        </w:rPr>
+        <w:t>HTML5</w:t>
+      </w:r>
+      <w:r>
+        <w:t xml:space="preserve"> y </w:t>
+      </w:r>
+      <w:r>
+        <w:rPr>
+          <w:b/>
+          <w:bCs/>
+        </w:rPr>
+        <w:t>CSS3</w:t>
+      </w:r>
+      <w:r>
+        <w:t>, buscando una presentación limpia, estructurada y adaptada a las necesidades de cada uno de los perfiles de usuario de la aplicación. Cada rol dispone de sus propias vistas personalizadas, con un panel de inicio diferenciado que muestra únicamente las funcionalidades que le corresponden según sus permisos.</w:t>
+      </w:r>
+    </w:p>
+    <w:p>
+      <w:pPr>
+        <w:jc w:val="both"/>
+      </w:pPr>
+      <w:r>
+        <w:rPr>
+          <w:b/>
+          <w:bCs/>
+        </w:rPr>
+        <w:t>Base de datos</w:t>
+      </w:r>
+    </w:p>
+    <w:p>
+      <w:pPr>
+        <w:jc w:val="both"/>
+      </w:pPr>
+      <w:r>
+        <w:t xml:space="preserve">El sistema gestor de base de datos utilizado es </w:t>
+      </w:r>
+      <w:r>
+        <w:rPr>
+          <w:b/>
+          <w:bCs/>
+        </w:rPr>
+        <w:t>MySQL</w:t>
+      </w:r>
+      <w:r>
+        <w:t>, configurado con el dialecto MySQL8Dialect de Hibernate para garantizar la compatibilidad con las características específicas de esta versión. La base de datos se denomina gestiona y está compuesta por ocho tablas: empresa, coordinador, alumno, gestor, administracion, documento, practica, registro_horas y notificacion. Cada tabla ha sido diseñada respetando los criterios de normalización y definiendo las claves foráneas necesarias para mantener la integridad referencial entre las distintas entidades del sistema.</w:t>
+      </w:r>
+    </w:p>
+    <w:p>
+      <w:pPr>
+        <w:jc w:val="both"/>
+      </w:pPr>
+      <w:r>
+        <w:t xml:space="preserve">La conexión con la base de datos se gestiona a través del driver oficial mysql-connector-j, y todos los parámetros de conexión, como la URL, el usuario, la contraseña y el dialecto, se configuran en el fichero application.properties. La estrategia de generación del esquema utilizada es ddl-auto=update, lo que permite que Hibernate actualice automáticamente la estructura de la base de datos en función de las entidades definidas en el código, sin necesidad de ejecutar scripts DDL manualmente durante el </w:t>
+      </w:r>
+      <w:r>
+        <w:lastRenderedPageBreak/>
+        <w:t>desarrollo. No obstante, para la inicialización del entorno de pruebas se ha elaborado el script PruebaTablaBase.sql, que contiene tanto la creación completa del esquema como la inserción de datos de prueba para los cuatro roles del sistema.</w:t>
+      </w:r>
+    </w:p>
+    <w:p>
+      <w:pPr>
+        <w:jc w:val="both"/>
+      </w:pPr>
+      <w:r>
+        <w:t xml:space="preserve">Adicionalmente, se ha incluido la dependencia de </w:t>
+      </w:r>
+      <w:r>
+        <w:rPr>
+          <w:b/>
+          <w:bCs/>
+        </w:rPr>
+        <w:t>H2</w:t>
+      </w:r>
+      <w:r>
+        <w:t>, una base de datos relacional en memoria, que puede utilizarse como alternativa a MySQL en entornos de desarrollo o pruebas donde no sea posible disponer de una instancia de MySQL activa.</w:t>
+      </w:r>
+    </w:p>
+    <w:p>
+      <w:pPr>
+        <w:jc w:val="both"/>
+      </w:pPr>
+      <w:r>
+        <w:rPr>
+          <w:b/>
+          <w:bCs/>
+        </w:rPr>
+        <w:t>Herramientas de desarrollo y construcción</w:t>
+      </w:r>
+    </w:p>
+    <w:p>
+      <w:pPr>
+        <w:jc w:val="both"/>
+      </w:pPr>
+      <w:r>
+        <w:t xml:space="preserve">El proyecto ha sido desarrollado íntegramente con el entorno de desarrollo integrado </w:t>
+      </w:r>
+      <w:r>
+        <w:rPr>
+          <w:b/>
+          <w:bCs/>
+        </w:rPr>
+        <w:t>IntelliJ IDEA</w:t>
+      </w:r>
+      <w:r>
+        <w:t>, que ha proporcionado las herramientas necesarias para la escritura, depuración y ejecución del código durante todo el ciclo de desarrollo.</w:t>
+      </w:r>
+    </w:p>
+    <w:p>
+      <w:pPr>
+        <w:jc w:val="both"/>
+      </w:pPr>
+      <w:r>
+        <w:t xml:space="preserve">Como herramienta de construcción y gestión de dependencias se ha utilizado </w:t>
+      </w:r>
+      <w:r>
+        <w:rPr>
+          <w:b/>
+          <w:bCs/>
+        </w:rPr>
+        <w:t>Maven</w:t>
+      </w:r>
+      <w:r>
+        <w:t>, con el plugin spring-boot-maven-plugin que permite el empaquetado de la aplicación como un archivo .jar ejecutable y su lanzamiento directo desde la línea de comandos. La gestión del wrapper de Maven se realiza a través del fichero .mvn/wrapper/maven-wrapper.properties, lo que garantiza que el proyecto pueda construirse con la versión correcta de Maven independientemente de la que esté instalada en el sistema.</w:t>
+      </w:r>
+    </w:p>
+    <w:p>
+      <w:pPr>
+        <w:jc w:val="both"/>
+      </w:pPr>
+      <w:r>
+        <w:t xml:space="preserve">Para el control de versiones del código fuente se ha utilizado </w:t>
+      </w:r>
+      <w:r>
+        <w:rPr>
+          <w:b/>
+          <w:bCs/>
+        </w:rPr>
+        <w:t>Git</w:t>
+      </w:r>
+      <w:r>
+        <w:t xml:space="preserve">, con repositorio remoto alojado en </w:t>
+      </w:r>
+      <w:r>
+        <w:rPr>
+          <w:b/>
+          <w:bCs/>
+        </w:rPr>
+        <w:t>GitHub</w:t>
+      </w:r>
+      <w:r>
+        <w:t>, lo que ha permitido mantener un historial de cambios organizado y facilitar la recuperación de versiones anteriores del proyecto en caso de ser necesario.</w:t>
+      </w:r>
+    </w:p>
+    <w:p>
+      <w:pPr>
+        <w:jc w:val="both"/>
+      </w:pPr>
+      <w:r>
+        <w:t xml:space="preserve">En cuanto a las herramientas de diseño y documentación, el modelo entidad-relación y los diagramas de casos de uso han sido elaborados con </w:t>
+      </w:r>
+      <w:r>
+        <w:rPr>
+          <w:b/>
+          <w:bCs/>
+        </w:rPr>
+        <w:t>PlantUML</w:t>
+      </w:r>
+      <w:r>
+        <w:t xml:space="preserve">, una herramienta que permite generar diagramas UML a partir de código de texto de forma sencilla y reproducible. El diagrama de clases se ha desarrollado con la plataforma </w:t>
+      </w:r>
+      <w:r>
+        <w:rPr>
+          <w:b/>
+          <w:bCs/>
+        </w:rPr>
+        <w:t>Creately</w:t>
+      </w:r>
+      <w:r>
+        <w:t xml:space="preserve">, y los wireframes de las interfaces gráficas de usuario se han diseñado con </w:t>
+      </w:r>
+      <w:r>
+        <w:rPr>
+          <w:b/>
+          <w:bCs/>
+        </w:rPr>
+        <w:t>Wireframe.cc</w:t>
+      </w:r>
+      <w:r>
+        <w:t>, lo que ha permitido definir y validar la estructura visual de cada una de las pantallas de la aplicación antes de su implementación.</w:t>
+      </w:r>
+    </w:p>
+    <w:p/>
     <w:p>
       <w:pPr>
         <w:pStyle w:val="Ttulo2"/>
@@ -16903,6 +17349,965 @@
         <w:t>PLANIFICACIÓN Y PRESUPUESTO</w:t>
       </w:r>
       <w:bookmarkEnd w:id="26"/>
+    </w:p>
+    <w:p>
+      <w:pPr>
+        <w:jc w:val="both"/>
+      </w:pPr>
+      <w:r>
+        <w:t>Para poder llevar a cabo el desarrollo del proyecto de manera organizada y dentro de los plazos establecidos, se ha realizado una planificación detallada de todas las tareas que lo componen, así como una estimación de los costes asociados a su desarrollo. La correcta planificación de un proyecto software es un elemento fundamental para garantizar que las distintas fases se ejecuten de manera ordenada, que los objetivos se cumplan en los tiempos previstos y que los recursos disponibles se utilicen de forma eficiente. A continuación, se presentan tanto el diagrama de Gantt con la distribución temporal de las tareas como el desglose completo de los costes estimados del proyecto.</w:t>
+      </w:r>
+    </w:p>
+    <w:p>
+      <w:pPr>
+        <w:pStyle w:val="Prrafodelista"/>
+        <w:keepNext/>
+        <w:keepLines/>
+        <w:numPr>
+          <w:ilvl w:val="0"/>
+          <w:numId w:val="3"/>
+        </w:numPr>
+        <w:spacing w:before="160" w:after="80"/>
+        <w:contextualSpacing w:val="0"/>
+        <w:jc w:val="both"/>
+        <w:outlineLvl w:val="1"/>
+        <w:rPr>
+          <w:rFonts w:asciiTheme="majorHAnsi" w:eastAsiaTheme="majorEastAsia" w:hAnsiTheme="majorHAnsi" w:cstheme="majorBidi"/>
+          <w:vanish/>
+          <w:color w:val="0F4761" w:themeColor="accent1" w:themeShade="BF"/>
+          <w:sz w:val="32"/>
+          <w:szCs w:val="32"/>
+        </w:rPr>
+      </w:pPr>
+    </w:p>
+    <w:p>
+      <w:pPr>
+        <w:pStyle w:val="Prrafodelista"/>
+        <w:keepNext/>
+        <w:keepLines/>
+        <w:numPr>
+          <w:ilvl w:val="0"/>
+          <w:numId w:val="3"/>
+        </w:numPr>
+        <w:spacing w:before="160" w:after="80"/>
+        <w:contextualSpacing w:val="0"/>
+        <w:jc w:val="both"/>
+        <w:outlineLvl w:val="1"/>
+        <w:rPr>
+          <w:rFonts w:asciiTheme="majorHAnsi" w:eastAsiaTheme="majorEastAsia" w:hAnsiTheme="majorHAnsi" w:cstheme="majorBidi"/>
+          <w:vanish/>
+          <w:color w:val="0F4761" w:themeColor="accent1" w:themeShade="BF"/>
+          <w:sz w:val="32"/>
+          <w:szCs w:val="32"/>
+        </w:rPr>
+      </w:pPr>
+      <w:bookmarkStart w:id="27" w:name="_Toc210123171"/>
+      <w:bookmarkStart w:id="28" w:name="_Toc210123298"/>
+      <w:bookmarkStart w:id="29" w:name="_Toc210124629"/>
+      <w:bookmarkStart w:id="30" w:name="_Toc210125387"/>
+      <w:bookmarkEnd w:id="27"/>
+      <w:bookmarkEnd w:id="28"/>
+      <w:bookmarkEnd w:id="29"/>
+      <w:bookmarkEnd w:id="30"/>
+    </w:p>
+    <w:p>
+      <w:pPr>
+        <w:pStyle w:val="Prrafodelista"/>
+        <w:keepNext/>
+        <w:keepLines/>
+        <w:numPr>
+          <w:ilvl w:val="0"/>
+          <w:numId w:val="3"/>
+        </w:numPr>
+        <w:spacing w:before="160" w:after="80"/>
+        <w:contextualSpacing w:val="0"/>
+        <w:jc w:val="both"/>
+        <w:outlineLvl w:val="1"/>
+        <w:rPr>
+          <w:rFonts w:asciiTheme="majorHAnsi" w:eastAsiaTheme="majorEastAsia" w:hAnsiTheme="majorHAnsi" w:cstheme="majorBidi"/>
+          <w:vanish/>
+          <w:color w:val="0F4761" w:themeColor="accent1" w:themeShade="BF"/>
+          <w:sz w:val="32"/>
+          <w:szCs w:val="32"/>
+        </w:rPr>
+      </w:pPr>
+      <w:bookmarkStart w:id="31" w:name="_Toc210123172"/>
+      <w:bookmarkStart w:id="32" w:name="_Toc210123299"/>
+      <w:bookmarkStart w:id="33" w:name="_Toc210124630"/>
+      <w:bookmarkStart w:id="34" w:name="_Toc210125388"/>
+      <w:bookmarkEnd w:id="31"/>
+      <w:bookmarkEnd w:id="32"/>
+      <w:bookmarkEnd w:id="33"/>
+      <w:bookmarkEnd w:id="34"/>
+    </w:p>
+    <w:p>
+      <w:pPr>
+        <w:pStyle w:val="Ttulo2"/>
+        <w:numPr>
+          <w:ilvl w:val="1"/>
+          <w:numId w:val="3"/>
+        </w:numPr>
+        <w:jc w:val="both"/>
+      </w:pPr>
+      <w:bookmarkStart w:id="35" w:name="_Toc210125389"/>
+      <w:r>
+        <w:t>DIAGRAMA DE GANTT</w:t>
+      </w:r>
+      <w:bookmarkEnd w:id="35"/>
+    </w:p>
+    <w:p>
+      <w:pPr>
+        <w:jc w:val="both"/>
+      </w:pPr>
+      <w:r>
+        <w:t>El desarrollo del proyecto ha tenido lugar entre los meses de enero y mayo de 2026, con una duración total aproximada de cinco meses. A lo largo de este periodo, el trabajo se ha organizado en una serie de fases secuenciales e interrelacionadas, cada una de las cuales ha dado pie a la siguiente una vez completada. Esta estructura por fases ha permitido mantener un orden lógico en el desarrollo y facilitar la detección de posibles problemas en cada etapa antes de avanzar a la siguiente. Las fases en las que se ha dividido el proyecto son las que se describen a continuación.</w:t>
+      </w:r>
+    </w:p>
+    <w:p>
+      <w:pPr>
+        <w:jc w:val="both"/>
+      </w:pPr>
+      <w:r>
+        <w:lastRenderedPageBreak/>
+        <w:t xml:space="preserve">La primera fase, correspondiente al </w:t>
+      </w:r>
+      <w:r>
+        <w:rPr>
+          <w:b/>
+          <w:bCs/>
+        </w:rPr>
+        <w:t>análisis y planificación</w:t>
+      </w:r>
+      <w:r>
+        <w:t>, se ha llevado a cabo durante el mes de enero de 2026. En esta fase inicial se han identificado las necesidades reales del sistema que se pretendía desarrollar, se han definido en detalle los requisitos funcionales y no funcionales de la aplicación, se han establecido los casos de uso necesarios para cubrir todas las funcionalidades requeridas y se ha elaborado la planificación general del proyecto, incluyendo la estimación de tiempos y la distribución de las tareas. Esta fase ha resultado fundamental para sentar unas bases sólidas sobre las que construir todo el trabajo posterior, ya que una definición clara de los requisitos desde el inicio ha evitado tener que realizar cambios importantes en etapas más avanzadas del desarrollo.</w:t>
+      </w:r>
+    </w:p>
+    <w:p>
+      <w:pPr>
+        <w:jc w:val="both"/>
+      </w:pPr>
+      <w:r>
+        <w:t xml:space="preserve">La segunda fase, de </w:t>
+      </w:r>
+      <w:r>
+        <w:rPr>
+          <w:b/>
+          <w:bCs/>
+        </w:rPr>
+        <w:t>diseño</w:t>
+      </w:r>
+      <w:r>
+        <w:t>, se ha desarrollado a lo largo del mes de febrero de 2026. Durante esta etapa se han elaborado todos los modelos de datos del sistema, incluyendo el diagrama entidad-relación y el diagrama de clases de la aplicación. Asimismo, se han diseñado los wireframes de cada una de las interfaces gráficas de usuario y se han definido los cuatro mapas de navegabilidad correspondientes a los perfiles de Alumno, Coordinador, Gestor y Administración. El trabajo realizado en esta fase ha servido como guía y referencia durante todo el desarrollo posterior, asegurando que la implementación se ajustara a lo planificado.</w:t>
+      </w:r>
+    </w:p>
+    <w:p>
+      <w:pPr>
+        <w:jc w:val="both"/>
+      </w:pPr>
+      <w:r>
+        <w:t xml:space="preserve">La tercera fase, correspondiente al </w:t>
+      </w:r>
+      <w:r>
+        <w:rPr>
+          <w:b/>
+          <w:bCs/>
+        </w:rPr>
+        <w:t>desarrollo del backend</w:t>
+      </w:r>
+      <w:r>
+        <w:t>, ha tenido lugar entre los meses de febrero y marzo de 2026. En esta fase se ha llevado a cabo la implementación de toda la lógica de negocio de la aplicación, incluyendo la definición de las entidades del modelo de datos, los repositorios de acceso a la base de datos, los servicios que encapsulan la lógica de cada módulo y los controladores que gestionan las peticiones HTTP. También se ha configurado la base de datos MySQL, se ha implementado el sistema de autenticación mediante sesiones HTTP con cifrado BCrypt de las contraseñas, y se han desarrollado tanto el sistema de notificaciones automáticas como el scheduler encargado de actualizar el estado de las prácticas de forma periódica. Esta ha sido la fase de mayor carga técnica y complejidad del proyecto.</w:t>
+      </w:r>
+    </w:p>
+    <w:p>
+      <w:pPr>
+        <w:jc w:val="both"/>
+      </w:pPr>
+      <w:r>
+        <w:t xml:space="preserve">La cuarta fase, de </w:t>
+      </w:r>
+      <w:r>
+        <w:rPr>
+          <w:b/>
+          <w:bCs/>
+        </w:rPr>
+        <w:t>desarrollo del frontend</w:t>
+      </w:r>
+      <w:r>
+        <w:t>, se ha llevado a cabo durante el mes de marzo y parte de abril de 2026. En ella se han implementado todas las vistas de la aplicación utilizando Thymeleaf como motor de plantillas, junto con HTML5 y CSS3 para la maquetación y el estilo visual. Cada vista ha sido desarrollada siguiendo los wireframes definidos en la fase de diseño y adaptada al perfil de usuario correspondiente, de forma que cada rol dispone de un panel de inicio y unas pantallas propias con únicamente las funcionalidades que le corresponden según sus permisos.</w:t>
+      </w:r>
+    </w:p>
+    <w:p>
+      <w:pPr>
+        <w:jc w:val="both"/>
+      </w:pPr>
+      <w:r>
+        <w:t xml:space="preserve">La quinta fase, de </w:t>
+      </w:r>
+      <w:r>
+        <w:rPr>
+          <w:b/>
+          <w:bCs/>
+        </w:rPr>
+        <w:t>pruebas y corrección de errores</w:t>
+      </w:r>
+      <w:r>
+        <w:t>, se ha desarrollado durante el mes de abril de 2026. En esta etapa se ha verificado el correcto funcionamiento de todas las funcionalidades implementadas en las fases anteriores, se han detectado y corregido los errores encontrados durante las pruebas y se ha validado que la aplicación cumple con los requisitos definidos en la fase de análisis. Las pruebas han abarcado tanto la funcionalidad de cada módulo de forma individual como el flujo completo de la aplicación para cada uno de los cuatro perfiles de usuario.</w:t>
+      </w:r>
+    </w:p>
+    <w:p>
+      <w:pPr>
+        <w:jc w:val="both"/>
+      </w:pPr>
+      <w:r>
+        <w:t xml:space="preserve">Por último, la sexta y última fase, de </w:t>
+      </w:r>
+      <w:r>
+        <w:rPr>
+          <w:b/>
+          <w:bCs/>
+        </w:rPr>
+        <w:t>documentación y entrega</w:t>
+      </w:r>
+      <w:r>
+        <w:t>, ha tenido lugar durante el mes de mayo de 2026. En esta fase se ha redactado la documentación completa del proyecto, incluyendo todos los apartados que forman parte del presente documento, y se ha preparado la entrega final para la convocatoria de mayo de 2026.</w:t>
+      </w:r>
+    </w:p>
+    <w:p>
+      <w:pPr>
+        <w:jc w:val="both"/>
+      </w:pPr>
+      <w:r>
+        <w:t>A continuación, se muestra la tabla resumen del diagrama de Gantt con la distribución temporal de cada una de las fases descritas:</w:t>
+      </w:r>
+    </w:p>
+    <w:p>
+      <w:pPr>
+        <w:jc w:val="both"/>
+      </w:pPr>
+      <w:r>
+        <w:rPr>
+          <w:noProof/>
+        </w:rPr>
+        <w:lastRenderedPageBreak/>
+        <w:drawing>
+          <wp:inline distT="0" distB="0" distL="0" distR="0" wp14:anchorId="69602FEA" wp14:editId="7ED168A7">
+            <wp:extent cx="6115050" cy="4015105"/>
+            <wp:effectExtent l="0" t="0" r="0" b="4445"/>
+            <wp:docPr id="1678313694" name="Imagen 9"/>
+            <wp:cNvGraphicFramePr>
+              <a:graphicFrameLocks xmlns:a="http://schemas.openxmlformats.org/drawingml/2006/main" noChangeAspect="1"/>
+            </wp:cNvGraphicFramePr>
+            <a:graphic xmlns:a="http://schemas.openxmlformats.org/drawingml/2006/main">
+              <a:graphicData uri="http://schemas.openxmlformats.org/drawingml/2006/picture">
+                <pic:pic xmlns:pic="http://schemas.openxmlformats.org/drawingml/2006/picture">
+                  <pic:nvPicPr>
+                    <pic:cNvPr id="0" name="Picture 10"/>
+                    <pic:cNvPicPr>
+                      <a:picLocks noChangeAspect="1" noChangeArrowheads="1"/>
+                    </pic:cNvPicPr>
+                  </pic:nvPicPr>
+                  <pic:blipFill>
+                    <a:blip r:embed="rId40">
+                      <a:extLst>
+                        <a:ext uri="{28A0092B-C50C-407E-A947-70E740481C1C}">
+                          <a14:useLocalDpi xmlns:a14="http://schemas.microsoft.com/office/drawing/2010/main" val="0"/>
+                        </a:ext>
+                      </a:extLst>
+                    </a:blip>
+                    <a:srcRect/>
+                    <a:stretch>
+                      <a:fillRect/>
+                    </a:stretch>
+                  </pic:blipFill>
+                  <pic:spPr bwMode="auto">
+                    <a:xfrm>
+                      <a:off x="0" y="0"/>
+                      <a:ext cx="6115050" cy="4015105"/>
+                    </a:xfrm>
+                    <a:prstGeom prst="rect">
+                      <a:avLst/>
+                    </a:prstGeom>
+                    <a:noFill/>
+                    <a:ln>
+                      <a:noFill/>
+                    </a:ln>
+                  </pic:spPr>
+                </pic:pic>
+              </a:graphicData>
+            </a:graphic>
+          </wp:inline>
+        </w:drawing>
+      </w:r>
+    </w:p>
+    <w:p>
+      <w:pPr>
+        <w:pStyle w:val="Ttulo2"/>
+        <w:numPr>
+          <w:ilvl w:val="1"/>
+          <w:numId w:val="3"/>
+        </w:numPr>
+        <w:jc w:val="both"/>
+      </w:pPr>
+      <w:bookmarkStart w:id="36" w:name="_Toc210125390"/>
+      <w:r>
+        <w:t>ESTIMACIONES DE COSTES</w:t>
+      </w:r>
+      <w:bookmarkEnd w:id="36"/>
+    </w:p>
+    <w:p>
+      <w:pPr>
+        <w:jc w:val="both"/>
+      </w:pPr>
+      <w:r>
+        <w:t xml:space="preserve">Para la elaboración de las estimaciones de costes del proyecto se ha partido de un contexto en el que el desarrollo ha sido llevado a cabo íntegramente por una única persona, la cual asume el rol de desarrollador junior. Este perfil se corresponde con un profesional en proceso de formación o con experiencia inicial en el sector, cuya tarifa horaria en el mercado laboral se sitúa habitualmente en un rango de entre 15 y 18 euros por hora. Para los cálculos que se presentan a continuación se ha tomado como referencia el valor medio de este rango, esto es, </w:t>
+      </w:r>
+      <w:r>
+        <w:rPr>
+          <w:b/>
+          <w:bCs/>
+        </w:rPr>
+        <w:t>16,50 €/hora</w:t>
+      </w:r>
+      <w:r>
+        <w:t>.</w:t>
+      </w:r>
+    </w:p>
+    <w:p>
+      <w:pPr>
+        <w:jc w:val="both"/>
+      </w:pPr>
+      <w:r>
+        <w:t xml:space="preserve">A fin de establecer el número total de horas invertidas en el proyecto, se ha realizado una estimación detallada por fases, teniendo en cuenta la duración de cada una de ellas, la complejidad técnica de las tareas que la componen y la dedicación media estimada en cada periodo. El resultado de esta estimación arroja un total de aproximadamente </w:t>
+      </w:r>
+      <w:r>
+        <w:rPr>
+          <w:b/>
+          <w:bCs/>
+        </w:rPr>
+        <w:t>200 horas</w:t>
+      </w:r>
+      <w:r>
+        <w:t xml:space="preserve"> de trabajo, distribuidas de la siguiente manera:</w:t>
+      </w:r>
+    </w:p>
+    <w:p>
+      <w:pPr>
+        <w:jc w:val="both"/>
+      </w:pPr>
+      <w:r>
+        <w:t>Para poder realizar una estimación lo más ajustada posible a la realidad, se ha desglosado el total de horas invertidas en el proyecto fase por fase, justificando en cada caso el tiempo dedicado en función de la complejidad y el volumen de trabajo que ha supuesto cada una de ellas.</w:t>
+      </w:r>
+    </w:p>
+    <w:p>
+      <w:pPr>
+        <w:jc w:val="both"/>
+      </w:pPr>
+      <w:r>
+        <w:t xml:space="preserve">La fase de </w:t>
+      </w:r>
+      <w:r>
+        <w:rPr>
+          <w:b/>
+          <w:bCs/>
+        </w:rPr>
+        <w:t>análisis y planificación</w:t>
+      </w:r>
+      <w:r>
+        <w:t xml:space="preserve"> ha supuesto un total de </w:t>
+      </w:r>
+      <w:r>
+        <w:rPr>
+          <w:b/>
+          <w:bCs/>
+        </w:rPr>
+        <w:t>20 horas</w:t>
+      </w:r>
+      <w:r>
+        <w:t>. Aunque es una de las fases con menor carga de trabajo en términos de horas, su importancia es crucial, ya que en ella se han definido todos los requisitos del sistema, los casos de uso, los actores implicados y la planificación general del proyecto. Al tratarse de un proyecto individual con un alcance bien delimitado desde el inicio, no ha sido necesario invertir un número excesivo de horas en esta fase, aunque sí se ha dedicado el tiempo suficiente para garantizar una definición clara y completa de lo que se iba a desarrollar.</w:t>
+      </w:r>
+    </w:p>
+    <w:p>
+      <w:pPr>
+        <w:jc w:val="both"/>
+      </w:pPr>
+      <w:r>
+        <w:t xml:space="preserve">La fase de </w:t>
+      </w:r>
+      <w:r>
+        <w:rPr>
+          <w:b/>
+          <w:bCs/>
+        </w:rPr>
+        <w:t>diseño</w:t>
+      </w:r>
+      <w:r>
+        <w:t xml:space="preserve"> ha tenido también una duración estimada de </w:t>
+      </w:r>
+      <w:r>
+        <w:rPr>
+          <w:b/>
+          <w:bCs/>
+        </w:rPr>
+        <w:t>20 horas</w:t>
+      </w:r>
+      <w:r>
+        <w:t xml:space="preserve">. En este tiempo se han elaborado el diagrama entidad-relación, el diagrama de clases, los wireframes de todas las pantallas </w:t>
+      </w:r>
+      <w:r>
+        <w:lastRenderedPageBreak/>
+        <w:t>de la aplicación y los cuatro mapas de navegabilidad correspondientes a cada perfil de usuario. El hecho de contar con cuatro roles diferenciados, cada uno con sus propias vistas y flujos de navegación, ha incrementado el volumen de trabajo de esta fase respecto a lo que habría supuesto un sistema con un único perfil de usuario.</w:t>
+      </w:r>
+    </w:p>
+    <w:p>
+      <w:pPr>
+        <w:jc w:val="both"/>
+      </w:pPr>
+      <w:r>
+        <w:t xml:space="preserve">La fase de </w:t>
+      </w:r>
+      <w:r>
+        <w:rPr>
+          <w:b/>
+          <w:bCs/>
+        </w:rPr>
+        <w:t>desarrollo del backend</w:t>
+      </w:r>
+      <w:r>
+        <w:t xml:space="preserve"> ha sido, con diferencia, la más costosa en términos de horas, con un total estimado de </w:t>
+      </w:r>
+      <w:r>
+        <w:rPr>
+          <w:b/>
+          <w:bCs/>
+        </w:rPr>
+        <w:t>75 horas</w:t>
+      </w:r>
+      <w:r>
+        <w:t>. Esto se debe a que en ella se ha implementado prácticamente toda la lógica de negocio de la aplicación, incluyendo la definición de las entidades y su mapeo con la base de datos, los repositorios, los servicios de cada módulo, los controladores, la configuración de Spring Security, el sistema de autenticación manual mediante sesiones HTTP, el cifrado de contraseñas con BCrypt, el sistema de notificaciones y el scheduler de actualización automática del estado de las prácticas. La complejidad técnica de esta fase, unida al elevado número de módulos que componen la aplicación, justifica ampliamente el mayor número de horas estimadas.</w:t>
+      </w:r>
+    </w:p>
+    <w:p>
+      <w:pPr>
+        <w:jc w:val="both"/>
+      </w:pPr>
+      <w:r>
+        <w:t xml:space="preserve">La fase de </w:t>
+      </w:r>
+      <w:r>
+        <w:rPr>
+          <w:b/>
+          <w:bCs/>
+        </w:rPr>
+        <w:t>desarrollo del frontend</w:t>
+      </w:r>
+      <w:r>
+        <w:t xml:space="preserve"> ha supuesto un total estimado de </w:t>
+      </w:r>
+      <w:r>
+        <w:rPr>
+          <w:b/>
+          <w:bCs/>
+        </w:rPr>
+        <w:t>50 horas</w:t>
+      </w:r>
+      <w:r>
+        <w:t>. En este tiempo se han implementado todas las vistas de la aplicación con Thymeleaf, HTML5 y CSS3, adaptando cada pantalla al perfil de usuario correspondiente. El elevado número de vistas necesarias para cubrir las funcionalidades de los cuatro roles, junto con la necesidad de mantener una coherencia visual en todas ellas, explica que esta fase haya requerido una dedicación significativa, aunque inferior a la del backend dado que la lógica de presentación es menos compleja que la lógica de negocio.</w:t>
+      </w:r>
+    </w:p>
+    <w:p>
+      <w:pPr>
+        <w:jc w:val="both"/>
+      </w:pPr>
+      <w:r>
+        <w:t xml:space="preserve">La fase de </w:t>
+      </w:r>
+      <w:r>
+        <w:rPr>
+          <w:b/>
+          <w:bCs/>
+        </w:rPr>
+        <w:t>pruebas y corrección de errores</w:t>
+      </w:r>
+      <w:r>
+        <w:t xml:space="preserve"> ha requerido un total estimado de </w:t>
+      </w:r>
+      <w:r>
+        <w:rPr>
+          <w:b/>
+          <w:bCs/>
+        </w:rPr>
+        <w:t>20 horas</w:t>
+      </w:r>
+      <w:r>
+        <w:t>. Durante este tiempo se han verificado todas las funcionalidades implementadas, se han recorrido los flujos completos de cada perfil de usuario y se han detectado y corregido los errores encontrados. Aunque en un proyecto profesional esta fase suele requerir una dedicación mayor, el hecho de haber realizado pruebas informales de forma continua durante el desarrollo ha reducido el número de errores acumulados, haciendo que el proceso de pruebas formal haya sido más ágil.</w:t>
+      </w:r>
+    </w:p>
+    <w:p>
+      <w:pPr>
+        <w:jc w:val="both"/>
+      </w:pPr>
+      <w:r>
+        <w:t xml:space="preserve">Por último, la fase de </w:t>
+      </w:r>
+      <w:r>
+        <w:rPr>
+          <w:b/>
+          <w:bCs/>
+        </w:rPr>
+        <w:t>documentación y entrega</w:t>
+      </w:r>
+      <w:r>
+        <w:t xml:space="preserve"> ha supuesto un total estimado de </w:t>
+      </w:r>
+      <w:r>
+        <w:rPr>
+          <w:b/>
+          <w:bCs/>
+        </w:rPr>
+        <w:t>15 horas</w:t>
+      </w:r>
+      <w:r>
+        <w:t>, correspondientes a la redacción del presente documento y a la preparación de la entrega final del proyecto. Al haberse ido tomando notas y registrando decisiones de diseño a lo largo del desarrollo, la elaboración de la documentación ha resultado más fluida, lo que explica el número relativamente reducido de horas asignadas a esta fase.</w:t>
+      </w:r>
+    </w:p>
+    <w:p>
+      <w:pPr>
+        <w:jc w:val="both"/>
+      </w:pPr>
+      <w:r>
+        <w:t>Una vez establecida la estimación de horas por fase, se procede a detallar el desglose completo de los costes del proyecto, diferenciando entre los costes de desarrollo, los costes de software y los costes de infraestructura.</w:t>
+      </w:r>
+    </w:p>
+    <w:p>
+      <w:pPr>
+        <w:jc w:val="both"/>
+      </w:pPr>
+      <w:r>
+        <w:rPr>
+          <w:b/>
+          <w:bCs/>
+        </w:rPr>
+        <w:t>Costes de desarrollo</w:t>
+      </w:r>
+    </w:p>
+    <w:p>
+      <w:pPr>
+        <w:jc w:val="both"/>
+      </w:pPr>
+      <w:r>
+        <w:t>El coste de desarrollo constituye la partida más importante del presupuesto, ya que representa el valor del tiempo invertido en la construcción de la aplicación. Este coste se obtiene multiplicando el total de horas estimadas por el coste por hora del perfil de desarrollador junior:</w:t>
+      </w:r>
+    </w:p>
+    <w:p>
+      <w:pPr>
+        <w:jc w:val="both"/>
+      </w:pPr>
+      <w:r>
+        <w:t xml:space="preserve">200 horas × 16,50 €/hora = </w:t>
+      </w:r>
+      <w:r>
+        <w:rPr>
+          <w:b/>
+          <w:bCs/>
+        </w:rPr>
+        <w:t>3.300,00 €</w:t>
+      </w:r>
+    </w:p>
+    <w:p>
+      <w:pPr>
+        <w:jc w:val="both"/>
+      </w:pPr>
+      <w:r>
+        <w:t xml:space="preserve">Este importe refleja el coste que tendría el desarrollo del proyecto en un contexto profesional real, en el que el trabajo realizado fuese remunerado a la tarifa de </w:t>
+      </w:r>
+      <w:r>
+        <w:rPr>
+          <w:u w:val="single"/>
+        </w:rPr>
+        <w:t>mercado</w:t>
+      </w:r>
+      <w:r>
+        <w:t xml:space="preserve"> correspondiente al perfil indicado.</w:t>
+      </w:r>
+    </w:p>
+    <w:p>
+      <w:pPr>
+        <w:jc w:val="both"/>
+        <w:rPr>
+          <w:b/>
+          <w:bCs/>
+        </w:rPr>
+      </w:pPr>
+      <w:r>
+        <w:rPr>
+          <w:b/>
+          <w:bCs/>
+        </w:rPr>
+        <w:t>Costes de software</w:t>
+      </w:r>
+    </w:p>
+    <w:p>
+      <w:pPr>
+        <w:jc w:val="both"/>
+      </w:pPr>
+      <w:r>
+        <w:t>Una de las ventajas más destacables de la pila tecnológica elegida para el desarrollo de Gestion@ es que la totalidad de las herramientas y tecnologías utilizadas son de uso gratuito o de código abierto, lo que ha permitido mantener los costes de software en cero euros.</w:t>
+      </w:r>
+    </w:p>
+    <w:p>
+      <w:pPr>
+        <w:jc w:val="both"/>
+      </w:pPr>
+      <w:r>
+        <w:lastRenderedPageBreak/>
+        <w:t xml:space="preserve">En lo que respecta al lenguaje y al framework principal, tanto </w:t>
+      </w:r>
+      <w:r>
+        <w:rPr>
+          <w:b/>
+          <w:bCs/>
+        </w:rPr>
+        <w:t>Java 21</w:t>
+      </w:r>
+      <w:r>
+        <w:t xml:space="preserve">, distribuido bajo la licencia GPL v2 con Classpath Exception, como </w:t>
+      </w:r>
+      <w:r>
+        <w:rPr>
+          <w:b/>
+          <w:bCs/>
+        </w:rPr>
+        <w:t>Spring Boot 3.2.5</w:t>
+      </w:r>
+      <w:r>
+        <w:t xml:space="preserve"> y todos sus módulos, distribuidos bajo la licencia Apache License 2.0, son completamente gratuitos. Lo mismo ocurre con </w:t>
+      </w:r>
+      <w:r>
+        <w:rPr>
+          <w:b/>
+          <w:bCs/>
+        </w:rPr>
+        <w:t>Thymeleaf</w:t>
+      </w:r>
+      <w:r>
+        <w:t xml:space="preserve"> y </w:t>
+      </w:r>
+      <w:r>
+        <w:rPr>
+          <w:b/>
+          <w:bCs/>
+        </w:rPr>
+        <w:t>Maven</w:t>
+      </w:r>
+      <w:r>
+        <w:t>, que también se distribuyen bajo la licencia Apache License 2.0 sin coste alguno.</w:t>
+      </w:r>
+    </w:p>
+    <w:p>
+      <w:pPr>
+        <w:jc w:val="both"/>
+      </w:pPr>
+      <w:r>
+        <w:t xml:space="preserve">El sistema gestor de base de datos </w:t>
+      </w:r>
+      <w:r>
+        <w:rPr>
+          <w:b/>
+          <w:bCs/>
+        </w:rPr>
+        <w:t>MySQL</w:t>
+      </w:r>
+      <w:r>
+        <w:t xml:space="preserve"> se ha utilizado en su edición Community, que se distribuye bajo la licencia GPL v2 y es de uso totalmente gratuito. Para las herramientas de control de versiones, tanto </w:t>
+      </w:r>
+      <w:r>
+        <w:rPr>
+          <w:b/>
+          <w:bCs/>
+        </w:rPr>
+        <w:t>Git</w:t>
+      </w:r>
+      <w:r>
+        <w:t xml:space="preserve">, distribuido bajo la licencia GPL v2, como </w:t>
+      </w:r>
+      <w:r>
+        <w:rPr>
+          <w:b/>
+          <w:bCs/>
+        </w:rPr>
+        <w:t>GitHub</w:t>
+      </w:r>
+      <w:r>
+        <w:t xml:space="preserve"> en su plan gratuito, han sido utilizados sin ningún coste asociado.</w:t>
+      </w:r>
+    </w:p>
+    <w:p>
+      <w:pPr>
+        <w:jc w:val="both"/>
+      </w:pPr>
+      <w:r>
+        <w:t xml:space="preserve">En cuanto al entorno de desarrollo, se ha utilizado </w:t>
+      </w:r>
+      <w:r>
+        <w:rPr>
+          <w:b/>
+          <w:bCs/>
+        </w:rPr>
+        <w:t>IntelliJ IDEA Community Edition</w:t>
+      </w:r>
+      <w:r>
+        <w:t>, la versión gratuita del IDE, distribuida bajo la licencia Apache License 2.0, por lo que tampoco ha supuesto ningún coste para el proyecto.</w:t>
+      </w:r>
+    </w:p>
+    <w:p>
+      <w:pPr>
+        <w:jc w:val="both"/>
+      </w:pPr>
+      <w:r>
+        <w:t xml:space="preserve">Por último, las herramientas de diseño y documentación utilizadas tampoco han generado gasto alguno. </w:t>
+      </w:r>
+      <w:r>
+        <w:rPr>
+          <w:b/>
+          <w:bCs/>
+        </w:rPr>
+        <w:t>PlantUML</w:t>
+      </w:r>
+      <w:r>
+        <w:t xml:space="preserve">, empleado para la elaboración de los diagramas UML, se distribuye bajo la licencia GPL v3. Tanto </w:t>
+      </w:r>
+      <w:r>
+        <w:rPr>
+          <w:b/>
+          <w:bCs/>
+        </w:rPr>
+        <w:t>Wireframe.cc</w:t>
+      </w:r>
+      <w:r>
+        <w:t xml:space="preserve">, utilizado para el diseño de los wireframes, como </w:t>
+      </w:r>
+      <w:r>
+        <w:rPr>
+          <w:b/>
+          <w:bCs/>
+        </w:rPr>
+        <w:t>Creately</w:t>
+      </w:r>
+      <w:r>
+        <w:t>, empleado para la elaboración del diagrama de clases, han sido utilizados en sus planes gratuitos respectivos.</w:t>
+      </w:r>
+    </w:p>
+    <w:p>
+      <w:pPr>
+        <w:jc w:val="both"/>
+      </w:pPr>
+      <w:r>
+        <w:t xml:space="preserve">En definitiva, el coste total en concepto de software asciende a </w:t>
+      </w:r>
+      <w:r>
+        <w:rPr>
+          <w:b/>
+          <w:bCs/>
+        </w:rPr>
+        <w:t>0,00 €</w:t>
+      </w:r>
+      <w:r>
+        <w:t>, lo que pone de manifiesto la madurez y la accesibilidad del ecosistema de desarrollo Java en la actualidad y representa una ventaja significativa desde el punto de vista económico, especialmente en proyectos desarrollados en un contexto educativo o por desarrolladores individuales.</w:t>
+      </w:r>
+    </w:p>
+    <w:p>
+      <w:pPr>
+        <w:jc w:val="both"/>
+      </w:pPr>
+      <w:r>
+        <w:rPr>
+          <w:b/>
+          <w:bCs/>
+        </w:rPr>
+        <w:t>Costes de infraestructura</w:t>
+      </w:r>
+    </w:p>
+    <w:p>
+      <w:pPr>
+        <w:jc w:val="both"/>
+      </w:pPr>
+      <w:r>
+        <w:t>Durante toda la fase de desarrollo, la aplicación ha sido ejecutada y probada en un entorno local, utilizando el propio equipo del desarrollador como servidor. Esta circunstancia ha supuesto que no se hayan generado costes de infraestructura de ningún tipo durante el desarrollo del proyecto.</w:t>
+      </w:r>
+    </w:p>
+    <w:p>
+      <w:pPr>
+        <w:jc w:val="both"/>
+      </w:pPr>
+      <w:r>
+        <w:t>No obstante, de cara a un posible despliegue en un entorno de producción real, sería necesario contemplar el coste de un servidor o servicio de hosting en el que alojar la aplicación. A modo orientativo, un servidor VPS básico con los recursos suficientes para soportar esta aplicación, como los ofrecidos por proveedores como DigitalOcean, Hetzner o AWS Lightsail, tendría un coste aproximado de entre 5 y 15 €/mes en función del proveedor y de las características del servidor contratado. Este coste no se incluye en el presupuesto del presente proyecto al quedar fuera del alcance del mismo, aunque sí se considera relevante mencionarlo de cara a una futura puesta en producción de la aplicación.</w:t>
+      </w:r>
+    </w:p>
+    <w:p>
+      <w:pPr>
+        <w:jc w:val="both"/>
+      </w:pPr>
+      <w:r>
+        <w:rPr>
+          <w:b/>
+          <w:bCs/>
+        </w:rPr>
+        <w:t>Resumen de costes</w:t>
+      </w:r>
+    </w:p>
+    <w:p>
+      <w:pPr>
+        <w:jc w:val="both"/>
+      </w:pPr>
+      <w:r>
+        <w:t>A modo de resumen, la siguiente tabla recoge el coste total estimado del proyecto, desglosado por las tres partidas analizadas:</w:t>
+      </w:r>
+    </w:p>
+    <w:tbl>
+      <w:tblPr>
+        <w:tblStyle w:val="Tablaconcuadrcula"/>
+        <w:tblW w:w="0" w:type="auto"/>
+        <w:tblLook w:val="04A0" w:firstRow="1" w:lastRow="0" w:firstColumn="1" w:lastColumn="0" w:noHBand="0" w:noVBand="1"/>
+      </w:tblPr>
+      <w:tblGrid>
+        <w:gridCol w:w="4814"/>
+        <w:gridCol w:w="4814"/>
+      </w:tblGrid>
+      <w:tr>
+        <w:tc>
+          <w:tcPr>
+            <w:tcW w:w="4814" w:type="dxa"/>
+            <w:shd w:val="clear" w:color="auto" w:fill="D9F2D0" w:themeFill="accent6" w:themeFillTint="33"/>
+          </w:tcPr>
+          <w:p>
+            <w:pPr>
+              <w:jc w:val="both"/>
+              <w:rPr>
+                <w:b/>
+                <w:bCs/>
+              </w:rPr>
+            </w:pPr>
+            <w:r>
+              <w:rPr>
+                <w:b/>
+                <w:bCs/>
+              </w:rPr>
+              <w:t>Concepto</w:t>
+            </w:r>
+          </w:p>
+        </w:tc>
+        <w:tc>
+          <w:tcPr>
+            <w:tcW w:w="4814" w:type="dxa"/>
+            <w:shd w:val="clear" w:color="auto" w:fill="D9F2D0" w:themeFill="accent6" w:themeFillTint="33"/>
+          </w:tcPr>
+          <w:p>
+            <w:pPr>
+              <w:jc w:val="both"/>
+              <w:rPr>
+                <w:b/>
+                <w:bCs/>
+              </w:rPr>
+            </w:pPr>
+            <w:r>
+              <w:rPr>
+                <w:b/>
+                <w:bCs/>
+              </w:rPr>
+              <w:t>Coste</w:t>
+            </w:r>
+          </w:p>
+        </w:tc>
+      </w:tr>
+      <w:tr>
+        <w:tc>
+          <w:tcPr>
+            <w:tcW w:w="4814" w:type="dxa"/>
+          </w:tcPr>
+          <w:p>
+            <w:pPr>
+              <w:jc w:val="both"/>
+            </w:pPr>
+            <w:r>
+              <w:t>Desarrollo (220 h x 16,50€/h)</w:t>
+            </w:r>
+          </w:p>
+        </w:tc>
+        <w:tc>
+          <w:tcPr>
+            <w:tcW w:w="4814" w:type="dxa"/>
+          </w:tcPr>
+          <w:p>
+            <w:pPr>
+              <w:jc w:val="both"/>
+            </w:pPr>
+            <w:r>
+              <w:t>3.300€</w:t>
+            </w:r>
+          </w:p>
+        </w:tc>
+      </w:tr>
+      <w:tr>
+        <w:tc>
+          <w:tcPr>
+            <w:tcW w:w="4814" w:type="dxa"/>
+            <w:shd w:val="clear" w:color="auto" w:fill="D9F2D0" w:themeFill="accent6" w:themeFillTint="33"/>
+          </w:tcPr>
+          <w:p>
+            <w:pPr>
+              <w:jc w:val="both"/>
+              <w:rPr>
+                <w:b/>
+                <w:bCs/>
+              </w:rPr>
+            </w:pPr>
+            <w:r>
+              <w:rPr>
+                <w:b/>
+                <w:bCs/>
+              </w:rPr>
+              <w:t>Total</w:t>
+            </w:r>
+          </w:p>
+        </w:tc>
+        <w:tc>
+          <w:tcPr>
+            <w:tcW w:w="4814" w:type="dxa"/>
+            <w:shd w:val="clear" w:color="auto" w:fill="D9F2D0" w:themeFill="accent6" w:themeFillTint="33"/>
+          </w:tcPr>
+          <w:p>
+            <w:pPr>
+              <w:jc w:val="both"/>
+              <w:rPr>
+                <w:b/>
+                <w:bCs/>
+              </w:rPr>
+            </w:pPr>
+            <w:r>
+              <w:rPr>
+                <w:b/>
+                <w:bCs/>
+              </w:rPr>
+              <w:t>3.300€</w:t>
+            </w:r>
+          </w:p>
+        </w:tc>
+      </w:tr>
+    </w:tbl>
+    <w:p/>
+    <w:p>
+      <w:pPr>
+        <w:pStyle w:val="Ttulo2"/>
+        <w:numPr>
+          <w:ilvl w:val="0"/>
+          <w:numId w:val="2"/>
+        </w:numPr>
+      </w:pPr>
+      <w:bookmarkStart w:id="37" w:name="_Toc210125391"/>
+      <w:r>
+        <w:t>FUTURAS MEJORAS Y AMPLIACIONES</w:t>
+      </w:r>
+      <w:bookmarkEnd w:id="37"/>
     </w:p>
     <w:p>
       <w:r>
@@ -16929,14 +18334,109 @@
           <w:szCs w:val="32"/>
         </w:rPr>
       </w:pPr>
-      <w:bookmarkStart w:id="27" w:name="_Toc210123170"/>
-      <w:bookmarkStart w:id="28" w:name="_Toc210123297"/>
-      <w:bookmarkStart w:id="29" w:name="_Toc210124628"/>
-      <w:bookmarkStart w:id="30" w:name="_Toc210125386"/>
-      <w:bookmarkEnd w:id="27"/>
-      <w:bookmarkEnd w:id="28"/>
-      <w:bookmarkEnd w:id="29"/>
-      <w:bookmarkEnd w:id="30"/>
+      <w:bookmarkStart w:id="38" w:name="_Toc210123176"/>
+      <w:bookmarkStart w:id="39" w:name="_Toc210123303"/>
+      <w:bookmarkStart w:id="40" w:name="_Toc210124634"/>
+      <w:bookmarkStart w:id="41" w:name="_Toc210125392"/>
+      <w:bookmarkEnd w:id="38"/>
+      <w:bookmarkEnd w:id="39"/>
+      <w:bookmarkEnd w:id="40"/>
+      <w:bookmarkEnd w:id="41"/>
+    </w:p>
+    <w:p>
+      <w:pPr>
+        <w:pStyle w:val="Ttulo2"/>
+        <w:numPr>
+          <w:ilvl w:val="1"/>
+          <w:numId w:val="3"/>
+        </w:numPr>
+      </w:pPr>
+      <w:bookmarkStart w:id="42" w:name="_Toc210125393"/>
+      <w:r>
+        <w:t>PROPUESTAS DE MEJORA Y AMPLIACIONES</w:t>
+      </w:r>
+      <w:bookmarkEnd w:id="42"/>
+    </w:p>
+    <w:p>
+      <w:r>
+        <w:t>(…)</w:t>
+      </w:r>
+    </w:p>
+    <w:p>
+      <w:pPr>
+        <w:pStyle w:val="Ttulo2"/>
+        <w:numPr>
+          <w:ilvl w:val="1"/>
+          <w:numId w:val="3"/>
+        </w:numPr>
+      </w:pPr>
+      <w:bookmarkStart w:id="43" w:name="_Toc210125394"/>
+      <w:r>
+        <w:t>IMPACTO Y RIESGO DE LOS CAMBIOS PROPUESTOS</w:t>
+      </w:r>
+      <w:bookmarkEnd w:id="43"/>
+    </w:p>
+    <w:p>
+      <w:r>
+        <w:t>(…)</w:t>
+      </w:r>
+    </w:p>
+    <w:p>
+      <w:pPr>
+        <w:pStyle w:val="Ttulo2"/>
+        <w:numPr>
+          <w:ilvl w:val="0"/>
+          <w:numId w:val="2"/>
+        </w:numPr>
+      </w:pPr>
+      <w:bookmarkStart w:id="44" w:name="_Toc210125395"/>
+      <w:r>
+        <w:t>RELACIÓN CON LOS MÓDULOS DEL CICLO</w:t>
+      </w:r>
+      <w:bookmarkEnd w:id="44"/>
+    </w:p>
+    <w:p>
+      <w:r>
+        <w:t>(…)</w:t>
+      </w:r>
+    </w:p>
+    <w:p>
+      <w:pPr>
+        <w:pStyle w:val="Ttulo2"/>
+        <w:numPr>
+          <w:ilvl w:val="0"/>
+          <w:numId w:val="2"/>
+        </w:numPr>
+      </w:pPr>
+      <w:bookmarkStart w:id="45" w:name="_Toc210125396"/>
+      <w:r>
+        <w:t>CONCLUSIONES</w:t>
+      </w:r>
+      <w:bookmarkEnd w:id="45"/>
+    </w:p>
+    <w:p>
+      <w:r>
+        <w:t>(…)</w:t>
+      </w:r>
+    </w:p>
+    <w:p>
+      <w:pPr>
+        <w:pStyle w:val="Ttulo2"/>
+        <w:numPr>
+          <w:ilvl w:val="0"/>
+          <w:numId w:val="2"/>
+        </w:numPr>
+      </w:pPr>
+      <w:bookmarkStart w:id="46" w:name="_Toc210125397"/>
+      <w:r>
+        <w:t>DESPLIEGUE DE LA APLICACIÓN</w:t>
+      </w:r>
+      <w:bookmarkEnd w:id="46"/>
+    </w:p>
+    <w:p>
+      <w:r>
+        <w:t>(...)</w:t>
+      </w:r>
     </w:p>
     <w:p>
       <w:pPr>
@@ -16958,14 +18458,14 @@
           <w:szCs w:val="32"/>
         </w:rPr>
       </w:pPr>
-      <w:bookmarkStart w:id="31" w:name="_Toc210123171"/>
-      <w:bookmarkStart w:id="32" w:name="_Toc210123298"/>
-      <w:bookmarkStart w:id="33" w:name="_Toc210124629"/>
-      <w:bookmarkStart w:id="34" w:name="_Toc210125387"/>
-      <w:bookmarkEnd w:id="31"/>
-      <w:bookmarkEnd w:id="32"/>
-      <w:bookmarkEnd w:id="33"/>
-      <w:bookmarkEnd w:id="34"/>
+      <w:bookmarkStart w:id="47" w:name="_Toc210123182"/>
+      <w:bookmarkStart w:id="48" w:name="_Toc210123309"/>
+      <w:bookmarkStart w:id="49" w:name="_Toc210124640"/>
+      <w:bookmarkStart w:id="50" w:name="_Toc210125398"/>
+      <w:bookmarkEnd w:id="47"/>
+      <w:bookmarkEnd w:id="48"/>
+      <w:bookmarkEnd w:id="49"/>
+      <w:bookmarkEnd w:id="50"/>
     </w:p>
     <w:p>
       <w:pPr>
@@ -16987,71 +18487,14 @@
           <w:szCs w:val="32"/>
         </w:rPr>
       </w:pPr>
-      <w:bookmarkStart w:id="35" w:name="_Toc210123172"/>
-      <w:bookmarkStart w:id="36" w:name="_Toc210123299"/>
-      <w:bookmarkStart w:id="37" w:name="_Toc210124630"/>
-      <w:bookmarkStart w:id="38" w:name="_Toc210125388"/>
-      <w:bookmarkEnd w:id="35"/>
-      <w:bookmarkEnd w:id="36"/>
-      <w:bookmarkEnd w:id="37"/>
-      <w:bookmarkEnd w:id="38"/>
-    </w:p>
-    <w:p>
-      <w:pPr>
-        <w:pStyle w:val="Ttulo2"/>
-        <w:numPr>
-          <w:ilvl w:val="1"/>
-          <w:numId w:val="3"/>
-        </w:numPr>
-      </w:pPr>
-      <w:bookmarkStart w:id="39" w:name="_Toc210125389"/>
-      <w:r>
-        <w:t>DIAGRAMA DE GANTT</w:t>
-      </w:r>
-      <w:bookmarkEnd w:id="39"/>
-    </w:p>
-    <w:p>
-      <w:r>
-        <w:t>(…)</w:t>
-      </w:r>
-    </w:p>
-    <w:p>
-      <w:pPr>
-        <w:pStyle w:val="Ttulo2"/>
-        <w:numPr>
-          <w:ilvl w:val="1"/>
-          <w:numId w:val="3"/>
-        </w:numPr>
-      </w:pPr>
-      <w:bookmarkStart w:id="40" w:name="_Toc210125390"/>
-      <w:r>
-        <w:t>ESTIMACIONES DE COSTES</w:t>
-      </w:r>
-      <w:bookmarkEnd w:id="40"/>
-    </w:p>
-    <w:p>
-      <w:r>
-        <w:t>(…)</w:t>
-      </w:r>
-    </w:p>
-    <w:p>
-      <w:pPr>
-        <w:pStyle w:val="Ttulo2"/>
-        <w:numPr>
-          <w:ilvl w:val="0"/>
-          <w:numId w:val="2"/>
-        </w:numPr>
-      </w:pPr>
-      <w:bookmarkStart w:id="41" w:name="_Toc210125391"/>
-      <w:r>
-        <w:t>FUTURAS MEJORAS Y AMPLIACIONES</w:t>
-      </w:r>
-      <w:bookmarkEnd w:id="41"/>
-    </w:p>
-    <w:p>
-      <w:r>
-        <w:t>(…)</w:t>
-      </w:r>
+      <w:bookmarkStart w:id="51" w:name="_Toc210123183"/>
+      <w:bookmarkStart w:id="52" w:name="_Toc210123310"/>
+      <w:bookmarkStart w:id="53" w:name="_Toc210124641"/>
+      <w:bookmarkStart w:id="54" w:name="_Toc210125399"/>
+      <w:bookmarkEnd w:id="51"/>
+      <w:bookmarkEnd w:id="52"/>
+      <w:bookmarkEnd w:id="53"/>
+      <w:bookmarkEnd w:id="54"/>
     </w:p>
     <w:p>
       <w:pPr>
@@ -17073,14 +18516,14 @@
           <w:szCs w:val="32"/>
         </w:rPr>
       </w:pPr>
-      <w:bookmarkStart w:id="42" w:name="_Toc210123176"/>
-      <w:bookmarkStart w:id="43" w:name="_Toc210123303"/>
-      <w:bookmarkStart w:id="44" w:name="_Toc210124634"/>
-      <w:bookmarkStart w:id="45" w:name="_Toc210125392"/>
-      <w:bookmarkEnd w:id="42"/>
-      <w:bookmarkEnd w:id="43"/>
-      <w:bookmarkEnd w:id="44"/>
-      <w:bookmarkEnd w:id="45"/>
+      <w:bookmarkStart w:id="55" w:name="_Toc210123184"/>
+      <w:bookmarkStart w:id="56" w:name="_Toc210123311"/>
+      <w:bookmarkStart w:id="57" w:name="_Toc210124642"/>
+      <w:bookmarkStart w:id="58" w:name="_Toc210125400"/>
+      <w:bookmarkEnd w:id="55"/>
+      <w:bookmarkEnd w:id="56"/>
+      <w:bookmarkEnd w:id="57"/>
+      <w:bookmarkEnd w:id="58"/>
     </w:p>
     <w:p>
       <w:pPr>
@@ -17090,30 +18533,11 @@
           <w:numId w:val="3"/>
         </w:numPr>
       </w:pPr>
-      <w:bookmarkStart w:id="46" w:name="_Toc210125393"/>
-      <w:r>
-        <w:t>PROPUESTAS DE MEJORA Y AMPLIACIONES</w:t>
-      </w:r>
-      <w:bookmarkEnd w:id="46"/>
-    </w:p>
-    <w:p>
-      <w:r>
-        <w:t>(…)</w:t>
-      </w:r>
-    </w:p>
-    <w:p>
-      <w:pPr>
-        <w:pStyle w:val="Ttulo2"/>
-        <w:numPr>
-          <w:ilvl w:val="1"/>
-          <w:numId w:val="3"/>
-        </w:numPr>
-      </w:pPr>
-      <w:bookmarkStart w:id="47" w:name="_Toc210125394"/>
-      <w:r>
-        <w:t>IMPACTO Y RIESGO DE LOS CAMBIOS PROPUESTOS</w:t>
-      </w:r>
-      <w:bookmarkEnd w:id="47"/>
+      <w:bookmarkStart w:id="59" w:name="_Toc210125401"/>
+      <w:r>
+        <w:t>INSTALACIÓN</w:t>
+      </w:r>
+      <w:bookmarkEnd w:id="59"/>
     </w:p>
     <w:p>
       <w:r>
@@ -17128,49 +18552,11 @@
           <w:numId w:val="2"/>
         </w:numPr>
       </w:pPr>
-      <w:bookmarkStart w:id="48" w:name="_Toc210125395"/>
-      <w:r>
-        <w:t>RELACIÓN CON LOS MÓDULOS DEL CICLO</w:t>
-      </w:r>
-      <w:bookmarkEnd w:id="48"/>
-    </w:p>
-    <w:p>
-      <w:r>
-        <w:t>(…)</w:t>
-      </w:r>
-    </w:p>
-    <w:p>
-      <w:pPr>
-        <w:pStyle w:val="Ttulo2"/>
-        <w:numPr>
-          <w:ilvl w:val="0"/>
-          <w:numId w:val="2"/>
-        </w:numPr>
-      </w:pPr>
-      <w:bookmarkStart w:id="49" w:name="_Toc210125396"/>
-      <w:r>
-        <w:t>CONCLUSIONES</w:t>
-      </w:r>
-      <w:bookmarkEnd w:id="49"/>
-    </w:p>
-    <w:p>
-      <w:r>
-        <w:t>(…)</w:t>
-      </w:r>
-    </w:p>
-    <w:p>
-      <w:pPr>
-        <w:pStyle w:val="Ttulo2"/>
-        <w:numPr>
-          <w:ilvl w:val="0"/>
-          <w:numId w:val="2"/>
-        </w:numPr>
-      </w:pPr>
-      <w:bookmarkStart w:id="50" w:name="_Toc210125397"/>
-      <w:r>
-        <w:t>DESPLIEGUE DE LA APLICACIÓN</w:t>
-      </w:r>
-      <w:bookmarkEnd w:id="50"/>
+      <w:bookmarkStart w:id="60" w:name="_Toc210125402"/>
+      <w:r>
+        <w:t>GUÍA DE ESTILOS Y MANUAL DE USUARIO</w:t>
+      </w:r>
+      <w:bookmarkEnd w:id="60"/>
     </w:p>
     <w:p>
       <w:r>
@@ -17197,72 +18583,14 @@
           <w:szCs w:val="32"/>
         </w:rPr>
       </w:pPr>
-      <w:bookmarkStart w:id="51" w:name="_Toc210123182"/>
-      <w:bookmarkStart w:id="52" w:name="_Toc210123309"/>
-      <w:bookmarkStart w:id="53" w:name="_Toc210124640"/>
-      <w:bookmarkStart w:id="54" w:name="_Toc210125398"/>
-      <w:bookmarkEnd w:id="51"/>
-      <w:bookmarkEnd w:id="52"/>
-      <w:bookmarkEnd w:id="53"/>
-      <w:bookmarkEnd w:id="54"/>
-    </w:p>
-    <w:p>
-      <w:pPr>
-        <w:pStyle w:val="Prrafodelista"/>
-        <w:keepNext/>
-        <w:keepLines/>
-        <w:numPr>
-          <w:ilvl w:val="0"/>
-          <w:numId w:val="3"/>
-        </w:numPr>
-        <w:spacing w:before="160" w:after="80"/>
-        <w:contextualSpacing w:val="0"/>
-        <w:outlineLvl w:val="1"/>
-        <w:rPr>
-          <w:rFonts w:asciiTheme="majorHAnsi" w:eastAsiaTheme="majorEastAsia" w:hAnsiTheme="majorHAnsi" w:cstheme="majorBidi"/>
-          <w:vanish/>
-          <w:color w:val="0F4761" w:themeColor="accent1" w:themeShade="BF"/>
-          <w:sz w:val="32"/>
-          <w:szCs w:val="32"/>
-        </w:rPr>
-      </w:pPr>
-      <w:bookmarkStart w:id="55" w:name="_Toc210123183"/>
-      <w:bookmarkStart w:id="56" w:name="_Toc210123310"/>
-      <w:bookmarkStart w:id="57" w:name="_Toc210124641"/>
-      <w:bookmarkStart w:id="58" w:name="_Toc210125399"/>
-      <w:bookmarkEnd w:id="55"/>
-      <w:bookmarkEnd w:id="56"/>
-      <w:bookmarkEnd w:id="57"/>
-      <w:bookmarkEnd w:id="58"/>
-    </w:p>
-    <w:p>
-      <w:pPr>
-        <w:pStyle w:val="Prrafodelista"/>
-        <w:keepNext/>
-        <w:keepLines/>
-        <w:numPr>
-          <w:ilvl w:val="0"/>
-          <w:numId w:val="3"/>
-        </w:numPr>
-        <w:spacing w:before="160" w:after="80"/>
-        <w:contextualSpacing w:val="0"/>
-        <w:outlineLvl w:val="1"/>
-        <w:rPr>
-          <w:rFonts w:asciiTheme="majorHAnsi" w:eastAsiaTheme="majorEastAsia" w:hAnsiTheme="majorHAnsi" w:cstheme="majorBidi"/>
-          <w:vanish/>
-          <w:color w:val="0F4761" w:themeColor="accent1" w:themeShade="BF"/>
-          <w:sz w:val="32"/>
-          <w:szCs w:val="32"/>
-        </w:rPr>
-      </w:pPr>
-      <w:bookmarkStart w:id="59" w:name="_Toc210123184"/>
-      <w:bookmarkStart w:id="60" w:name="_Toc210123311"/>
-      <w:bookmarkStart w:id="61" w:name="_Toc210124642"/>
-      <w:bookmarkStart w:id="62" w:name="_Toc210125400"/>
-      <w:bookmarkEnd w:id="59"/>
-      <w:bookmarkEnd w:id="60"/>
+      <w:bookmarkStart w:id="61" w:name="_Toc210123187"/>
+      <w:bookmarkStart w:id="62" w:name="_Toc210123314"/>
+      <w:bookmarkStart w:id="63" w:name="_Toc210124645"/>
+      <w:bookmarkStart w:id="64" w:name="_Toc210125403"/>
       <w:bookmarkEnd w:id="61"/>
       <w:bookmarkEnd w:id="62"/>
+      <w:bookmarkEnd w:id="63"/>
+      <w:bookmarkEnd w:id="64"/>
     </w:p>
     <w:p>
       <w:pPr>
@@ -17272,15 +18600,34 @@
           <w:numId w:val="3"/>
         </w:numPr>
       </w:pPr>
-      <w:bookmarkStart w:id="63" w:name="_Toc210125401"/>
-      <w:r>
-        <w:t>INSTALACIÓN</w:t>
-      </w:r>
-      <w:bookmarkEnd w:id="63"/>
-    </w:p>
-    <w:p>
-      <w:r>
-        <w:t>(…)</w:t>
+      <w:bookmarkStart w:id="65" w:name="_Toc210125404"/>
+      <w:r>
+        <w:t>GUÍA DE ESTILOS</w:t>
+      </w:r>
+      <w:bookmarkEnd w:id="65"/>
+    </w:p>
+    <w:p>
+      <w:r>
+        <w:t>(...)</w:t>
+      </w:r>
+    </w:p>
+    <w:p>
+      <w:pPr>
+        <w:pStyle w:val="Ttulo2"/>
+        <w:numPr>
+          <w:ilvl w:val="1"/>
+          <w:numId w:val="3"/>
+        </w:numPr>
+      </w:pPr>
+      <w:bookmarkStart w:id="66" w:name="_Toc210125405"/>
+      <w:r>
+        <w:t>MANUAL DE USUARIO</w:t>
+      </w:r>
+      <w:bookmarkEnd w:id="66"/>
+    </w:p>
+    <w:p>
+      <w:r>
+        <w:t>(...)</w:t>
       </w:r>
     </w:p>
     <w:p>
@@ -17291,98 +18638,11 @@
           <w:numId w:val="2"/>
         </w:numPr>
       </w:pPr>
-      <w:bookmarkStart w:id="64" w:name="_Toc210125402"/>
-      <w:r>
-        <w:t>GUÍA DE ESTILOS Y MANUAL DE USUARIO</w:t>
-      </w:r>
-      <w:bookmarkEnd w:id="64"/>
-    </w:p>
-    <w:p>
-      <w:r>
-        <w:t>(...)</w:t>
-      </w:r>
-    </w:p>
-    <w:p>
-      <w:pPr>
-        <w:pStyle w:val="Prrafodelista"/>
-        <w:keepNext/>
-        <w:keepLines/>
-        <w:numPr>
-          <w:ilvl w:val="0"/>
-          <w:numId w:val="3"/>
-        </w:numPr>
-        <w:spacing w:before="160" w:after="80"/>
-        <w:contextualSpacing w:val="0"/>
-        <w:outlineLvl w:val="1"/>
-        <w:rPr>
-          <w:rFonts w:asciiTheme="majorHAnsi" w:eastAsiaTheme="majorEastAsia" w:hAnsiTheme="majorHAnsi" w:cstheme="majorBidi"/>
-          <w:vanish/>
-          <w:color w:val="0F4761" w:themeColor="accent1" w:themeShade="BF"/>
-          <w:sz w:val="32"/>
-          <w:szCs w:val="32"/>
-        </w:rPr>
-      </w:pPr>
-      <w:bookmarkStart w:id="65" w:name="_Toc210123187"/>
-      <w:bookmarkStart w:id="66" w:name="_Toc210123314"/>
-      <w:bookmarkStart w:id="67" w:name="_Toc210124645"/>
-      <w:bookmarkStart w:id="68" w:name="_Toc210125403"/>
-      <w:bookmarkEnd w:id="65"/>
-      <w:bookmarkEnd w:id="66"/>
+      <w:bookmarkStart w:id="67" w:name="_Toc210125406"/>
+      <w:r>
+        <w:t>WEBGRAFÍA Y FUENTES DE INFORMACIÓN</w:t>
+      </w:r>
       <w:bookmarkEnd w:id="67"/>
-      <w:bookmarkEnd w:id="68"/>
-    </w:p>
-    <w:p>
-      <w:pPr>
-        <w:pStyle w:val="Ttulo2"/>
-        <w:numPr>
-          <w:ilvl w:val="1"/>
-          <w:numId w:val="3"/>
-        </w:numPr>
-      </w:pPr>
-      <w:bookmarkStart w:id="69" w:name="_Toc210125404"/>
-      <w:r>
-        <w:t>GUÍA DE ESTILOS</w:t>
-      </w:r>
-      <w:bookmarkEnd w:id="69"/>
-    </w:p>
-    <w:p>
-      <w:r>
-        <w:t>(...)</w:t>
-      </w:r>
-    </w:p>
-    <w:p>
-      <w:pPr>
-        <w:pStyle w:val="Ttulo2"/>
-        <w:numPr>
-          <w:ilvl w:val="1"/>
-          <w:numId w:val="3"/>
-        </w:numPr>
-      </w:pPr>
-      <w:bookmarkStart w:id="70" w:name="_Toc210125405"/>
-      <w:r>
-        <w:t>MANUAL DE USUARIO</w:t>
-      </w:r>
-      <w:bookmarkEnd w:id="70"/>
-    </w:p>
-    <w:p>
-      <w:r>
-        <w:t>(...)</w:t>
-      </w:r>
-    </w:p>
-    <w:p>
-      <w:pPr>
-        <w:pStyle w:val="Ttulo2"/>
-        <w:numPr>
-          <w:ilvl w:val="0"/>
-          <w:numId w:val="2"/>
-        </w:numPr>
-      </w:pPr>
-      <w:bookmarkStart w:id="71" w:name="_Toc210125406"/>
-      <w:r>
-        <w:lastRenderedPageBreak/>
-        <w:t>WEBGRAFÍA Y FUENTES DE INFORMACIÓN</w:t>
-      </w:r>
-      <w:bookmarkEnd w:id="71"/>
     </w:p>
     <w:p/>
     <w:p>
@@ -17412,7 +18672,7 @@
     </w:p>
     <w:p/>
     <w:sectPr>
-      <w:footerReference w:type="default" r:id="rId40"/>
+      <w:footerReference w:type="default" r:id="rId41"/>
       <w:pgSz w:w="11906" w:h="16838"/>
       <w:pgMar w:top="1134" w:right="1134" w:bottom="1418" w:left="1134" w:header="709" w:footer="709" w:gutter="0"/>
       <w:pgNumType w:start="1"/>
@@ -17666,6 +18926,155 @@
 <file path=word/numbering.xml><?xml version="1.0" encoding="utf-8"?>
 <w:numbering xmlns:wpc="http://schemas.microsoft.com/office/word/2010/wordprocessingCanvas" xmlns:cx="http://schemas.microsoft.com/office/drawing/2014/chartex" xmlns:cx1="http://schemas.microsoft.com/office/drawing/2015/9/8/chartex" xmlns:cx2="http://schemas.microsoft.com/office/drawing/2015/10/21/chartex" xmlns:cx3="http://schemas.microsoft.com/office/drawing/2016/5/9/chartex" xmlns:cx4="http://schemas.microsoft.com/office/drawing/2016/5/10/chartex" xmlns:cx5="http://schemas.microsoft.com/office/drawing/2016/5/11/chartex" xmlns:cx6="http://schemas.microsoft.com/office/drawing/2016/5/12/chartex" xmlns:cx7="http://schemas.microsoft.com/office/drawing/2016/5/13/chartex" xmlns:cx8="http://schemas.microsoft.com/office/drawing/2016/5/14/chartex" xmlns:mc="http://schemas.openxmlformats.org/markup-compatibility/2006" xmlns:aink="http://schemas.microsoft.com/office/drawing/2016/ink" xmlns:am3d="http://schemas.microsoft.com/office/drawing/2017/model3d" xmlns:o="urn:schemas-microsoft-com:office:office" xmlns:oel="http://schemas.microsoft.com/office/2019/extlst" xmlns:r="http://schemas.openxmlformats.org/officeDocument/2006/relationships" xmlns:m="http://schemas.openxmlformats.org/officeDocument/2006/math" xmlns:v="urn:schemas-microsoft-com:vml" xmlns:wp14="http://schemas.microsoft.com/office/word/2010/wordprocessingDrawing" xmlns:wp="http://schemas.openxmlformats.org/drawingml/2006/wordprocessingDrawing" xmlns:w10="urn:schemas-microsoft-com:office:word" xmlns:w="http://schemas.openxmlformats.org/wordprocessingml/2006/main" xmlns:w14="http://schemas.microsoft.com/office/word/2010/wordml" xmlns:w15="http://schemas.microsoft.com/office/word/2012/wordml" xmlns:w16cex="http://schemas.microsoft.com/office/word/2018/wordml/cex" xmlns:w16cid="http://schemas.microsoft.com/office/word/2016/wordml/cid" xmlns:w16="http://schemas.microsoft.com/office/word/2018/wordml" xmlns:w16du="http://schemas.microsoft.com/office/word/2023/wordml/word16du" xmlns:w16sdtdh="http://schemas.microsoft.com/office/word/2020/wordml/sdtdatahash" xmlns:w16sdtfl="http://schemas.microsoft.com/office/word/2024/wordml/sdtformatlock" xmlns:w16se="http://schemas.microsoft.com/office/word/2015/wordml/symex" xmlns:wpg="http://schemas.microsoft.com/office/word/2010/wordprocessingGroup" xmlns:wpi="http://schemas.microsoft.com/office/word/2010/wordprocessingInk" xmlns:wne="http://schemas.microsoft.com/office/word/2006/wordml" xmlns:wps="http://schemas.microsoft.com/office/word/2010/wordprocessingShape" mc:Ignorable="w14 w15 w16se w16cid w16 w16cex w16sdtdh w16sdtfl w16du wp14">
   <w:abstractNum w:abstractNumId="0" w15:restartNumberingAfterBreak="0">
+    <w:nsid w:val="05345286"/>
+    <w:multiLevelType w:val="multilevel"/>
+    <w:tmpl w:val="40E05D46"/>
+    <w:lvl w:ilvl="0">
+      <w:start w:val="1"/>
+      <w:numFmt w:val="bullet"/>
+      <w:lvlText w:val=""/>
+      <w:lvlJc w:val="left"/>
+      <w:pPr>
+        <w:tabs>
+          <w:tab w:val="num" w:pos="720"/>
+        </w:tabs>
+        <w:ind w:left="720" w:hanging="360"/>
+      </w:pPr>
+      <w:rPr>
+        <w:rFonts w:ascii="Symbol" w:hAnsi="Symbol" w:hint="default"/>
+        <w:sz w:val="20"/>
+      </w:rPr>
+    </w:lvl>
+    <w:lvl w:ilvl="1" w:tentative="1">
+      <w:start w:val="1"/>
+      <w:numFmt w:val="bullet"/>
+      <w:lvlText w:val="o"/>
+      <w:lvlJc w:val="left"/>
+      <w:pPr>
+        <w:tabs>
+          <w:tab w:val="num" w:pos="1440"/>
+        </w:tabs>
+        <w:ind w:left="1440" w:hanging="360"/>
+      </w:pPr>
+      <w:rPr>
+        <w:rFonts w:ascii="Courier New" w:hAnsi="Courier New" w:hint="default"/>
+        <w:sz w:val="20"/>
+      </w:rPr>
+    </w:lvl>
+    <w:lvl w:ilvl="2" w:tentative="1">
+      <w:start w:val="1"/>
+      <w:numFmt w:val="bullet"/>
+      <w:lvlText w:val=""/>
+      <w:lvlJc w:val="left"/>
+      <w:pPr>
+        <w:tabs>
+          <w:tab w:val="num" w:pos="2160"/>
+        </w:tabs>
+        <w:ind w:left="2160" w:hanging="360"/>
+      </w:pPr>
+      <w:rPr>
+        <w:rFonts w:ascii="Wingdings" w:hAnsi="Wingdings" w:hint="default"/>
+        <w:sz w:val="20"/>
+      </w:rPr>
+    </w:lvl>
+    <w:lvl w:ilvl="3" w:tentative="1">
+      <w:start w:val="1"/>
+      <w:numFmt w:val="bullet"/>
+      <w:lvlText w:val=""/>
+      <w:lvlJc w:val="left"/>
+      <w:pPr>
+        <w:tabs>
+          <w:tab w:val="num" w:pos="2880"/>
+        </w:tabs>
+        <w:ind w:left="2880" w:hanging="360"/>
+      </w:pPr>
+      <w:rPr>
+        <w:rFonts w:ascii="Wingdings" w:hAnsi="Wingdings" w:hint="default"/>
+        <w:sz w:val="20"/>
+      </w:rPr>
+    </w:lvl>
+    <w:lvl w:ilvl="4" w:tentative="1">
+      <w:start w:val="1"/>
+      <w:numFmt w:val="bullet"/>
+      <w:lvlText w:val=""/>
+      <w:lvlJc w:val="left"/>
+      <w:pPr>
+        <w:tabs>
+          <w:tab w:val="num" w:pos="3600"/>
+        </w:tabs>
+        <w:ind w:left="3600" w:hanging="360"/>
+      </w:pPr>
+      <w:rPr>
+        <w:rFonts w:ascii="Wingdings" w:hAnsi="Wingdings" w:hint="default"/>
+        <w:sz w:val="20"/>
+      </w:rPr>
+    </w:lvl>
+    <w:lvl w:ilvl="5" w:tentative="1">
+      <w:start w:val="1"/>
+      <w:numFmt w:val="bullet"/>
+      <w:lvlText w:val=""/>
+      <w:lvlJc w:val="left"/>
+      <w:pPr>
+        <w:tabs>
+          <w:tab w:val="num" w:pos="4320"/>
+        </w:tabs>
+        <w:ind w:left="4320" w:hanging="360"/>
+      </w:pPr>
+      <w:rPr>
+        <w:rFonts w:ascii="Wingdings" w:hAnsi="Wingdings" w:hint="default"/>
+        <w:sz w:val="20"/>
+      </w:rPr>
+    </w:lvl>
+    <w:lvl w:ilvl="6" w:tentative="1">
+      <w:start w:val="1"/>
+      <w:numFmt w:val="bullet"/>
+      <w:lvlText w:val=""/>
+      <w:lvlJc w:val="left"/>
+      <w:pPr>
+        <w:tabs>
+          <w:tab w:val="num" w:pos="5040"/>
+        </w:tabs>
+        <w:ind w:left="5040" w:hanging="360"/>
+      </w:pPr>
+      <w:rPr>
+        <w:rFonts w:ascii="Wingdings" w:hAnsi="Wingdings" w:hint="default"/>
+        <w:sz w:val="20"/>
+      </w:rPr>
+    </w:lvl>
+    <w:lvl w:ilvl="7" w:tentative="1">
+      <w:start w:val="1"/>
+      <w:numFmt w:val="bullet"/>
+      <w:lvlText w:val=""/>
+      <w:lvlJc w:val="left"/>
+      <w:pPr>
+        <w:tabs>
+          <w:tab w:val="num" w:pos="5760"/>
+        </w:tabs>
+        <w:ind w:left="5760" w:hanging="360"/>
+      </w:pPr>
+      <w:rPr>
+        <w:rFonts w:ascii="Wingdings" w:hAnsi="Wingdings" w:hint="default"/>
+        <w:sz w:val="20"/>
+      </w:rPr>
+    </w:lvl>
+    <w:lvl w:ilvl="8" w:tentative="1">
+      <w:start w:val="1"/>
+      <w:numFmt w:val="bullet"/>
+      <w:lvlText w:val=""/>
+      <w:lvlJc w:val="left"/>
+      <w:pPr>
+        <w:tabs>
+          <w:tab w:val="num" w:pos="6480"/>
+        </w:tabs>
+        <w:ind w:left="6480" w:hanging="360"/>
+      </w:pPr>
+      <w:rPr>
+        <w:rFonts w:ascii="Wingdings" w:hAnsi="Wingdings" w:hint="default"/>
+        <w:sz w:val="20"/>
+      </w:rPr>
+    </w:lvl>
+  </w:abstractNum>
+  <w:abstractNum w:abstractNumId="1" w15:restartNumberingAfterBreak="0">
     <w:nsid w:val="07353CB1"/>
     <w:multiLevelType w:val="hybridMultilevel"/>
     <w:tmpl w:val="ECE0ECD0"/>
@@ -17754,7 +19163,7 @@
       </w:pPr>
     </w:lvl>
   </w:abstractNum>
-  <w:abstractNum w:abstractNumId="1" w15:restartNumberingAfterBreak="0">
+  <w:abstractNum w:abstractNumId="2" w15:restartNumberingAfterBreak="0">
     <w:nsid w:val="07AD1920"/>
     <w:multiLevelType w:val="hybridMultilevel"/>
     <w:tmpl w:val="1598D2C0"/>
@@ -17843,7 +19252,7 @@
       </w:pPr>
     </w:lvl>
   </w:abstractNum>
-  <w:abstractNum w:abstractNumId="2" w15:restartNumberingAfterBreak="0">
+  <w:abstractNum w:abstractNumId="3" w15:restartNumberingAfterBreak="0">
     <w:nsid w:val="0A313BDD"/>
     <w:multiLevelType w:val="hybridMultilevel"/>
     <w:tmpl w:val="0F382FE0"/>
@@ -17932,7 +19341,7 @@
       </w:pPr>
     </w:lvl>
   </w:abstractNum>
-  <w:abstractNum w:abstractNumId="3" w15:restartNumberingAfterBreak="0">
+  <w:abstractNum w:abstractNumId="4" w15:restartNumberingAfterBreak="0">
     <w:nsid w:val="13F2556B"/>
     <w:multiLevelType w:val="hybridMultilevel"/>
     <w:tmpl w:val="CE9A96EE"/>
@@ -18045,7 +19454,7 @@
       </w:rPr>
     </w:lvl>
   </w:abstractNum>
-  <w:abstractNum w:abstractNumId="4" w15:restartNumberingAfterBreak="0">
+  <w:abstractNum w:abstractNumId="5" w15:restartNumberingAfterBreak="0">
     <w:nsid w:val="1B2040A1"/>
     <w:multiLevelType w:val="multilevel"/>
     <w:tmpl w:val="0C0A001F"/>
@@ -18131,7 +19540,7 @@
       </w:pPr>
     </w:lvl>
   </w:abstractNum>
-  <w:abstractNum w:abstractNumId="5" w15:restartNumberingAfterBreak="0">
+  <w:abstractNum w:abstractNumId="6" w15:restartNumberingAfterBreak="0">
     <w:nsid w:val="1D113F47"/>
     <w:multiLevelType w:val="hybridMultilevel"/>
     <w:tmpl w:val="EC6C9AE6"/>
@@ -18220,7 +19629,7 @@
       </w:pPr>
     </w:lvl>
   </w:abstractNum>
-  <w:abstractNum w:abstractNumId="6" w15:restartNumberingAfterBreak="0">
+  <w:abstractNum w:abstractNumId="7" w15:restartNumberingAfterBreak="0">
     <w:nsid w:val="1D9B7E7E"/>
     <w:multiLevelType w:val="hybridMultilevel"/>
     <w:tmpl w:val="7E4A399C"/>
@@ -18308,7 +19717,7 @@
       </w:pPr>
     </w:lvl>
   </w:abstractNum>
-  <w:abstractNum w:abstractNumId="7" w15:restartNumberingAfterBreak="0">
+  <w:abstractNum w:abstractNumId="8" w15:restartNumberingAfterBreak="0">
     <w:nsid w:val="1DBE2810"/>
     <w:multiLevelType w:val="hybridMultilevel"/>
     <w:tmpl w:val="832494CC"/>
@@ -18396,7 +19805,7 @@
       </w:pPr>
     </w:lvl>
   </w:abstractNum>
-  <w:abstractNum w:abstractNumId="8" w15:restartNumberingAfterBreak="0">
+  <w:abstractNum w:abstractNumId="9" w15:restartNumberingAfterBreak="0">
     <w:nsid w:val="1DEA53A7"/>
     <w:multiLevelType w:val="multilevel"/>
     <w:tmpl w:val="8CB8D3B2"/>
@@ -18517,7 +19926,7 @@
       </w:rPr>
     </w:lvl>
   </w:abstractNum>
-  <w:abstractNum w:abstractNumId="9" w15:restartNumberingAfterBreak="0">
+  <w:abstractNum w:abstractNumId="10" w15:restartNumberingAfterBreak="0">
     <w:nsid w:val="1E38738B"/>
     <w:multiLevelType w:val="hybridMultilevel"/>
     <w:tmpl w:val="29BEE104"/>
@@ -18606,7 +20015,7 @@
       </w:pPr>
     </w:lvl>
   </w:abstractNum>
-  <w:abstractNum w:abstractNumId="10" w15:restartNumberingAfterBreak="0">
+  <w:abstractNum w:abstractNumId="11" w15:restartNumberingAfterBreak="0">
     <w:nsid w:val="241F6312"/>
     <w:multiLevelType w:val="hybridMultilevel"/>
     <w:tmpl w:val="AD58A682"/>
@@ -18695,7 +20104,7 @@
       </w:pPr>
     </w:lvl>
   </w:abstractNum>
-  <w:abstractNum w:abstractNumId="11" w15:restartNumberingAfterBreak="0">
+  <w:abstractNum w:abstractNumId="12" w15:restartNumberingAfterBreak="0">
     <w:nsid w:val="2AAE0CD6"/>
     <w:multiLevelType w:val="hybridMultilevel"/>
     <w:tmpl w:val="7B226802"/>
@@ -18784,7 +20193,7 @@
       </w:pPr>
     </w:lvl>
   </w:abstractNum>
-  <w:abstractNum w:abstractNumId="12" w15:restartNumberingAfterBreak="0">
+  <w:abstractNum w:abstractNumId="13" w15:restartNumberingAfterBreak="0">
     <w:nsid w:val="2D846244"/>
     <w:multiLevelType w:val="hybridMultilevel"/>
     <w:tmpl w:val="27E03B32"/>
@@ -18873,7 +20282,7 @@
       </w:pPr>
     </w:lvl>
   </w:abstractNum>
-  <w:abstractNum w:abstractNumId="13" w15:restartNumberingAfterBreak="0">
+  <w:abstractNum w:abstractNumId="14" w15:restartNumberingAfterBreak="0">
     <w:nsid w:val="30CD65A1"/>
     <w:multiLevelType w:val="hybridMultilevel"/>
     <w:tmpl w:val="1BEA6482"/>
@@ -18962,7 +20371,7 @@
       </w:pPr>
     </w:lvl>
   </w:abstractNum>
-  <w:abstractNum w:abstractNumId="14" w15:restartNumberingAfterBreak="0">
+  <w:abstractNum w:abstractNumId="15" w15:restartNumberingAfterBreak="0">
     <w:nsid w:val="327B635A"/>
     <w:multiLevelType w:val="hybridMultilevel"/>
     <w:tmpl w:val="AD58A682"/>
@@ -19051,7 +20460,7 @@
       </w:pPr>
     </w:lvl>
   </w:abstractNum>
-  <w:abstractNum w:abstractNumId="15" w15:restartNumberingAfterBreak="0">
+  <w:abstractNum w:abstractNumId="16" w15:restartNumberingAfterBreak="0">
     <w:nsid w:val="35220677"/>
     <w:multiLevelType w:val="hybridMultilevel"/>
     <w:tmpl w:val="D50826D8"/>
@@ -19140,7 +20549,7 @@
       </w:pPr>
     </w:lvl>
   </w:abstractNum>
-  <w:abstractNum w:abstractNumId="16" w15:restartNumberingAfterBreak="0">
+  <w:abstractNum w:abstractNumId="17" w15:restartNumberingAfterBreak="0">
     <w:nsid w:val="3D2C0AFE"/>
     <w:multiLevelType w:val="hybridMultilevel"/>
     <w:tmpl w:val="F19A5808"/>
@@ -19228,7 +20637,7 @@
       </w:pPr>
     </w:lvl>
   </w:abstractNum>
-  <w:abstractNum w:abstractNumId="17" w15:restartNumberingAfterBreak="0">
+  <w:abstractNum w:abstractNumId="18" w15:restartNumberingAfterBreak="0">
     <w:nsid w:val="490B7943"/>
     <w:multiLevelType w:val="hybridMultilevel"/>
     <w:tmpl w:val="8A36BF9C"/>
@@ -19314,7 +20723,7 @@
       </w:pPr>
     </w:lvl>
   </w:abstractNum>
-  <w:abstractNum w:abstractNumId="18" w15:restartNumberingAfterBreak="0">
+  <w:abstractNum w:abstractNumId="19" w15:restartNumberingAfterBreak="0">
     <w:nsid w:val="4A6E3572"/>
     <w:multiLevelType w:val="hybridMultilevel"/>
     <w:tmpl w:val="4C8E7B6E"/>
@@ -19426,7 +20835,7 @@
       </w:rPr>
     </w:lvl>
   </w:abstractNum>
-  <w:abstractNum w:abstractNumId="19" w15:restartNumberingAfterBreak="0">
+  <w:abstractNum w:abstractNumId="20" w15:restartNumberingAfterBreak="0">
     <w:nsid w:val="4BE25E70"/>
     <w:multiLevelType w:val="multilevel"/>
     <w:tmpl w:val="0C0A001F"/>
@@ -19519,7 +20928,7 @@
       </w:pPr>
     </w:lvl>
   </w:abstractNum>
-  <w:abstractNum w:abstractNumId="20" w15:restartNumberingAfterBreak="0">
+  <w:abstractNum w:abstractNumId="21" w15:restartNumberingAfterBreak="0">
     <w:nsid w:val="508014F6"/>
     <w:multiLevelType w:val="hybridMultilevel"/>
     <w:tmpl w:val="C9A67BD8"/>
@@ -19605,7 +21014,7 @@
       </w:pPr>
     </w:lvl>
   </w:abstractNum>
-  <w:abstractNum w:abstractNumId="21" w15:restartNumberingAfterBreak="0">
+  <w:abstractNum w:abstractNumId="22" w15:restartNumberingAfterBreak="0">
     <w:nsid w:val="66410FF1"/>
     <w:multiLevelType w:val="hybridMultilevel"/>
     <w:tmpl w:val="AD58A682"/>
@@ -19694,7 +21103,7 @@
       </w:pPr>
     </w:lvl>
   </w:abstractNum>
-  <w:abstractNum w:abstractNumId="22" w15:restartNumberingAfterBreak="0">
+  <w:abstractNum w:abstractNumId="23" w15:restartNumberingAfterBreak="0">
     <w:nsid w:val="6B77109A"/>
     <w:multiLevelType w:val="hybridMultilevel"/>
     <w:tmpl w:val="6AF6DA34"/>
@@ -19783,7 +21192,7 @@
       </w:pPr>
     </w:lvl>
   </w:abstractNum>
-  <w:abstractNum w:abstractNumId="23" w15:restartNumberingAfterBreak="0">
+  <w:abstractNum w:abstractNumId="24" w15:restartNumberingAfterBreak="0">
     <w:nsid w:val="6C315A37"/>
     <w:multiLevelType w:val="hybridMultilevel"/>
     <w:tmpl w:val="EB4EC2DA"/>
@@ -19872,7 +21281,156 @@
       </w:pPr>
     </w:lvl>
   </w:abstractNum>
-  <w:abstractNum w:abstractNumId="24" w15:restartNumberingAfterBreak="0">
+  <w:abstractNum w:abstractNumId="25" w15:restartNumberingAfterBreak="0">
+    <w:nsid w:val="6E2D0B05"/>
+    <w:multiLevelType w:val="multilevel"/>
+    <w:tmpl w:val="F2927104"/>
+    <w:lvl w:ilvl="0">
+      <w:start w:val="1"/>
+      <w:numFmt w:val="bullet"/>
+      <w:lvlText w:val=""/>
+      <w:lvlJc w:val="left"/>
+      <w:pPr>
+        <w:tabs>
+          <w:tab w:val="num" w:pos="720"/>
+        </w:tabs>
+        <w:ind w:left="720" w:hanging="360"/>
+      </w:pPr>
+      <w:rPr>
+        <w:rFonts w:ascii="Symbol" w:hAnsi="Symbol" w:hint="default"/>
+        <w:sz w:val="20"/>
+      </w:rPr>
+    </w:lvl>
+    <w:lvl w:ilvl="1" w:tentative="1">
+      <w:start w:val="1"/>
+      <w:numFmt w:val="bullet"/>
+      <w:lvlText w:val="o"/>
+      <w:lvlJc w:val="left"/>
+      <w:pPr>
+        <w:tabs>
+          <w:tab w:val="num" w:pos="1440"/>
+        </w:tabs>
+        <w:ind w:left="1440" w:hanging="360"/>
+      </w:pPr>
+      <w:rPr>
+        <w:rFonts w:ascii="Courier New" w:hAnsi="Courier New" w:hint="default"/>
+        <w:sz w:val="20"/>
+      </w:rPr>
+    </w:lvl>
+    <w:lvl w:ilvl="2" w:tentative="1">
+      <w:start w:val="1"/>
+      <w:numFmt w:val="bullet"/>
+      <w:lvlText w:val=""/>
+      <w:lvlJc w:val="left"/>
+      <w:pPr>
+        <w:tabs>
+          <w:tab w:val="num" w:pos="2160"/>
+        </w:tabs>
+        <w:ind w:left="2160" w:hanging="360"/>
+      </w:pPr>
+      <w:rPr>
+        <w:rFonts w:ascii="Wingdings" w:hAnsi="Wingdings" w:hint="default"/>
+        <w:sz w:val="20"/>
+      </w:rPr>
+    </w:lvl>
+    <w:lvl w:ilvl="3" w:tentative="1">
+      <w:start w:val="1"/>
+      <w:numFmt w:val="bullet"/>
+      <w:lvlText w:val=""/>
+      <w:lvlJc w:val="left"/>
+      <w:pPr>
+        <w:tabs>
+          <w:tab w:val="num" w:pos="2880"/>
+        </w:tabs>
+        <w:ind w:left="2880" w:hanging="360"/>
+      </w:pPr>
+      <w:rPr>
+        <w:rFonts w:ascii="Wingdings" w:hAnsi="Wingdings" w:hint="default"/>
+        <w:sz w:val="20"/>
+      </w:rPr>
+    </w:lvl>
+    <w:lvl w:ilvl="4" w:tentative="1">
+      <w:start w:val="1"/>
+      <w:numFmt w:val="bullet"/>
+      <w:lvlText w:val=""/>
+      <w:lvlJc w:val="left"/>
+      <w:pPr>
+        <w:tabs>
+          <w:tab w:val="num" w:pos="3600"/>
+        </w:tabs>
+        <w:ind w:left="3600" w:hanging="360"/>
+      </w:pPr>
+      <w:rPr>
+        <w:rFonts w:ascii="Wingdings" w:hAnsi="Wingdings" w:hint="default"/>
+        <w:sz w:val="20"/>
+      </w:rPr>
+    </w:lvl>
+    <w:lvl w:ilvl="5" w:tentative="1">
+      <w:start w:val="1"/>
+      <w:numFmt w:val="bullet"/>
+      <w:lvlText w:val=""/>
+      <w:lvlJc w:val="left"/>
+      <w:pPr>
+        <w:tabs>
+          <w:tab w:val="num" w:pos="4320"/>
+        </w:tabs>
+        <w:ind w:left="4320" w:hanging="360"/>
+      </w:pPr>
+      <w:rPr>
+        <w:rFonts w:ascii="Wingdings" w:hAnsi="Wingdings" w:hint="default"/>
+        <w:sz w:val="20"/>
+      </w:rPr>
+    </w:lvl>
+    <w:lvl w:ilvl="6" w:tentative="1">
+      <w:start w:val="1"/>
+      <w:numFmt w:val="bullet"/>
+      <w:lvlText w:val=""/>
+      <w:lvlJc w:val="left"/>
+      <w:pPr>
+        <w:tabs>
+          <w:tab w:val="num" w:pos="5040"/>
+        </w:tabs>
+        <w:ind w:left="5040" w:hanging="360"/>
+      </w:pPr>
+      <w:rPr>
+        <w:rFonts w:ascii="Wingdings" w:hAnsi="Wingdings" w:hint="default"/>
+        <w:sz w:val="20"/>
+      </w:rPr>
+    </w:lvl>
+    <w:lvl w:ilvl="7" w:tentative="1">
+      <w:start w:val="1"/>
+      <w:numFmt w:val="bullet"/>
+      <w:lvlText w:val=""/>
+      <w:lvlJc w:val="left"/>
+      <w:pPr>
+        <w:tabs>
+          <w:tab w:val="num" w:pos="5760"/>
+        </w:tabs>
+        <w:ind w:left="5760" w:hanging="360"/>
+      </w:pPr>
+      <w:rPr>
+        <w:rFonts w:ascii="Wingdings" w:hAnsi="Wingdings" w:hint="default"/>
+        <w:sz w:val="20"/>
+      </w:rPr>
+    </w:lvl>
+    <w:lvl w:ilvl="8" w:tentative="1">
+      <w:start w:val="1"/>
+      <w:numFmt w:val="bullet"/>
+      <w:lvlText w:val=""/>
+      <w:lvlJc w:val="left"/>
+      <w:pPr>
+        <w:tabs>
+          <w:tab w:val="num" w:pos="6480"/>
+        </w:tabs>
+        <w:ind w:left="6480" w:hanging="360"/>
+      </w:pPr>
+      <w:rPr>
+        <w:rFonts w:ascii="Wingdings" w:hAnsi="Wingdings" w:hint="default"/>
+        <w:sz w:val="20"/>
+      </w:rPr>
+    </w:lvl>
+  </w:abstractNum>
+  <w:abstractNum w:abstractNumId="26" w15:restartNumberingAfterBreak="0">
     <w:nsid w:val="701F222E"/>
     <w:multiLevelType w:val="hybridMultilevel"/>
     <w:tmpl w:val="8A788BFC"/>
@@ -19961,7 +21519,7 @@
       </w:pPr>
     </w:lvl>
   </w:abstractNum>
-  <w:abstractNum w:abstractNumId="25" w15:restartNumberingAfterBreak="0">
+  <w:abstractNum w:abstractNumId="27" w15:restartNumberingAfterBreak="0">
     <w:nsid w:val="729D4FB2"/>
     <w:multiLevelType w:val="hybridMultilevel"/>
     <w:tmpl w:val="AD58A682"/>
@@ -20050,7 +21608,7 @@
       </w:pPr>
     </w:lvl>
   </w:abstractNum>
-  <w:abstractNum w:abstractNumId="26" w15:restartNumberingAfterBreak="0">
+  <w:abstractNum w:abstractNumId="28" w15:restartNumberingAfterBreak="0">
     <w:nsid w:val="7396120A"/>
     <w:multiLevelType w:val="multilevel"/>
     <w:tmpl w:val="2FC860DA"/>
@@ -20171,7 +21729,7 @@
       </w:rPr>
     </w:lvl>
   </w:abstractNum>
-  <w:abstractNum w:abstractNumId="27" w15:restartNumberingAfterBreak="0">
+  <w:abstractNum w:abstractNumId="29" w15:restartNumberingAfterBreak="0">
     <w:nsid w:val="74871DFB"/>
     <w:multiLevelType w:val="hybridMultilevel"/>
     <w:tmpl w:val="515213FA"/>
@@ -20260,7 +21818,7 @@
       </w:pPr>
     </w:lvl>
   </w:abstractNum>
-  <w:abstractNum w:abstractNumId="28" w15:restartNumberingAfterBreak="0">
+  <w:abstractNum w:abstractNumId="30" w15:restartNumberingAfterBreak="0">
     <w:nsid w:val="772B7A6B"/>
     <w:multiLevelType w:val="hybridMultilevel"/>
     <w:tmpl w:val="F21E1E8E"/>
@@ -20349,7 +21907,7 @@
       </w:pPr>
     </w:lvl>
   </w:abstractNum>
-  <w:abstractNum w:abstractNumId="29" w15:restartNumberingAfterBreak="0">
+  <w:abstractNum w:abstractNumId="31" w15:restartNumberingAfterBreak="0">
     <w:nsid w:val="7A834B67"/>
     <w:multiLevelType w:val="hybridMultilevel"/>
     <w:tmpl w:val="B3C2A55A"/>
@@ -20439,94 +21997,100 @@
     </w:lvl>
   </w:abstractNum>
   <w:num w:numId="1" w16cid:durableId="1685324373">
+    <w:abstractNumId w:val="21"/>
+  </w:num>
+  <w:num w:numId="2" w16cid:durableId="140075275">
+    <w:abstractNumId w:val="3"/>
+  </w:num>
+  <w:num w:numId="3" w16cid:durableId="1807509435">
+    <w:abstractNumId w:val="5"/>
+  </w:num>
+  <w:num w:numId="4" w16cid:durableId="1860043655">
     <w:abstractNumId w:val="20"/>
   </w:num>
-  <w:num w:numId="2" w16cid:durableId="140075275">
+  <w:num w:numId="5" w16cid:durableId="576137220">
+    <w:abstractNumId w:val="18"/>
+  </w:num>
+  <w:num w:numId="6" w16cid:durableId="1353607871">
+    <w:abstractNumId w:val="4"/>
+  </w:num>
+  <w:num w:numId="7" w16cid:durableId="1938639744">
+    <w:abstractNumId w:val="7"/>
+  </w:num>
+  <w:num w:numId="8" w16cid:durableId="1728604553">
+    <w:abstractNumId w:val="17"/>
+  </w:num>
+  <w:num w:numId="9" w16cid:durableId="577788421">
+    <w:abstractNumId w:val="8"/>
+  </w:num>
+  <w:num w:numId="10" w16cid:durableId="1784495493">
+    <w:abstractNumId w:val="19"/>
+  </w:num>
+  <w:num w:numId="11" w16cid:durableId="1969583305">
+    <w:abstractNumId w:val="10"/>
+  </w:num>
+  <w:num w:numId="12" w16cid:durableId="766850888">
+    <w:abstractNumId w:val="1"/>
+  </w:num>
+  <w:num w:numId="13" w16cid:durableId="1634292680">
+    <w:abstractNumId w:val="16"/>
+  </w:num>
+  <w:num w:numId="14" w16cid:durableId="1086607418">
+    <w:abstractNumId w:val="14"/>
+  </w:num>
+  <w:num w:numId="15" w16cid:durableId="909656025">
+    <w:abstractNumId w:val="29"/>
+  </w:num>
+  <w:num w:numId="16" w16cid:durableId="1005285391">
+    <w:abstractNumId w:val="23"/>
+  </w:num>
+  <w:num w:numId="17" w16cid:durableId="264383722">
+    <w:abstractNumId w:val="12"/>
+  </w:num>
+  <w:num w:numId="18" w16cid:durableId="1652246241">
+    <w:abstractNumId w:val="15"/>
+  </w:num>
+  <w:num w:numId="19" w16cid:durableId="525214737">
+    <w:abstractNumId w:val="27"/>
+  </w:num>
+  <w:num w:numId="20" w16cid:durableId="1230842360">
+    <w:abstractNumId w:val="22"/>
+  </w:num>
+  <w:num w:numId="21" w16cid:durableId="1923299699">
+    <w:abstractNumId w:val="11"/>
+  </w:num>
+  <w:num w:numId="22" w16cid:durableId="219288820">
+    <w:abstractNumId w:val="6"/>
+  </w:num>
+  <w:num w:numId="23" w16cid:durableId="1173184547">
+    <w:abstractNumId w:val="30"/>
+  </w:num>
+  <w:num w:numId="24" w16cid:durableId="1822228864">
+    <w:abstractNumId w:val="26"/>
+  </w:num>
+  <w:num w:numId="25" w16cid:durableId="1804423079">
+    <w:abstractNumId w:val="24"/>
+  </w:num>
+  <w:num w:numId="26" w16cid:durableId="484778421">
+    <w:abstractNumId w:val="31"/>
+  </w:num>
+  <w:num w:numId="27" w16cid:durableId="210192061">
+    <w:abstractNumId w:val="13"/>
+  </w:num>
+  <w:num w:numId="28" w16cid:durableId="1478110484">
     <w:abstractNumId w:val="2"/>
   </w:num>
-  <w:num w:numId="3" w16cid:durableId="1807509435">
-    <w:abstractNumId w:val="4"/>
+  <w:num w:numId="29" w16cid:durableId="271326878">
+    <w:abstractNumId w:val="28"/>
   </w:num>
-  <w:num w:numId="4" w16cid:durableId="1860043655">
-    <w:abstractNumId w:val="19"/>
-  </w:num>
-  <w:num w:numId="5" w16cid:durableId="576137220">
-    <w:abstractNumId w:val="17"/>
-  </w:num>
-  <w:num w:numId="6" w16cid:durableId="1353607871">
-    <w:abstractNumId w:val="3"/>
-  </w:num>
-  <w:num w:numId="7" w16cid:durableId="1938639744">
-    <w:abstractNumId w:val="6"/>
-  </w:num>
-  <w:num w:numId="8" w16cid:durableId="1728604553">
-    <w:abstractNumId w:val="16"/>
-  </w:num>
-  <w:num w:numId="9" w16cid:durableId="577788421">
-    <w:abstractNumId w:val="7"/>
-  </w:num>
-  <w:num w:numId="10" w16cid:durableId="1784495493">
-    <w:abstractNumId w:val="18"/>
-  </w:num>
-  <w:num w:numId="11" w16cid:durableId="1969583305">
+  <w:num w:numId="30" w16cid:durableId="1766220815">
     <w:abstractNumId w:val="9"/>
   </w:num>
-  <w:num w:numId="12" w16cid:durableId="766850888">
-    <w:abstractNumId w:val="0"/>
-  </w:num>
-  <w:num w:numId="13" w16cid:durableId="1634292680">
-    <w:abstractNumId w:val="15"/>
-  </w:num>
-  <w:num w:numId="14" w16cid:durableId="1086607418">
-    <w:abstractNumId w:val="13"/>
-  </w:num>
-  <w:num w:numId="15" w16cid:durableId="909656025">
-    <w:abstractNumId w:val="27"/>
-  </w:num>
-  <w:num w:numId="16" w16cid:durableId="1005285391">
-    <w:abstractNumId w:val="22"/>
-  </w:num>
-  <w:num w:numId="17" w16cid:durableId="264383722">
-    <w:abstractNumId w:val="11"/>
-  </w:num>
-  <w:num w:numId="18" w16cid:durableId="1652246241">
-    <w:abstractNumId w:val="14"/>
-  </w:num>
-  <w:num w:numId="19" w16cid:durableId="525214737">
+  <w:num w:numId="31" w16cid:durableId="292056413">
     <w:abstractNumId w:val="25"/>
   </w:num>
-  <w:num w:numId="20" w16cid:durableId="1230842360">
-    <w:abstractNumId w:val="21"/>
-  </w:num>
-  <w:num w:numId="21" w16cid:durableId="1923299699">
-    <w:abstractNumId w:val="10"/>
-  </w:num>
-  <w:num w:numId="22" w16cid:durableId="219288820">
-    <w:abstractNumId w:val="5"/>
-  </w:num>
-  <w:num w:numId="23" w16cid:durableId="1173184547">
-    <w:abstractNumId w:val="28"/>
-  </w:num>
-  <w:num w:numId="24" w16cid:durableId="1822228864">
-    <w:abstractNumId w:val="24"/>
-  </w:num>
-  <w:num w:numId="25" w16cid:durableId="1804423079">
-    <w:abstractNumId w:val="23"/>
-  </w:num>
-  <w:num w:numId="26" w16cid:durableId="484778421">
-    <w:abstractNumId w:val="29"/>
-  </w:num>
-  <w:num w:numId="27" w16cid:durableId="210192061">
-    <w:abstractNumId w:val="12"/>
-  </w:num>
-  <w:num w:numId="28" w16cid:durableId="1478110484">
-    <w:abstractNumId w:val="1"/>
-  </w:num>
-  <w:num w:numId="29" w16cid:durableId="271326878">
-    <w:abstractNumId w:val="26"/>
-  </w:num>
-  <w:num w:numId="30" w16cid:durableId="1766220815">
-    <w:abstractNumId w:val="8"/>
+  <w:num w:numId="32" w16cid:durableId="1636793211">
+    <w:abstractNumId w:val="0"/>
   </w:num>
 </w:numbering>
 </file>
@@ -21141,7 +22705,6 @@
   <w:style w:type="character" w:default="1" w:styleId="Fuentedeprrafopredeter">
     <w:name w:val="Default Paragraph Font"/>
     <w:uiPriority w:val="1"/>
-    <w:semiHidden/>
     <w:unhideWhenUsed/>
   </w:style>
   <w:style w:type="table" w:default="1" w:styleId="Tablanormal">

</xml_diff>